<commit_message>
Rebuild /integrations/gohighlevel page spec against product guide
Reconcile the GoHighLevel page to the audited integration guide
(25 Sep 2026). Remove the invented workflow-trigger and sub-account
snapshot/rebilling claims; the integration is calendar booking plus
contact match-or-create, connected per agent. Reorder to ranking-page
and conversion structure: outcome hero, compliance proof high up,
plain "what it does", how it works on a call, real setup steps (connect
+ sub-account, Calendar ID, Calendar Booking + timezone, functions,
publish), grounded FAQ. Zero em-dashes; figures reconciled.

Co-Authored-By: Claude Opus 4.8 <noreply@anthropic.com>
Claude-Session: https://claude.ai/code/session_01UhVChLeNNjFDr6eASTMGhh
</commit_message>
<xml_diff>
--- a/seo-audit/Trillet-Integration-GoHighLevel.docx
+++ b/seo-audit/Trillet-Integration-GoHighLevel.docx
@@ -32,7 +32,7 @@
           <w:sz w:val="34"/>
           <w:szCs w:val="34"/>
         </w:rPr>
-        <w:t xml:space="preserve">Trillet + GoHighLevel: Voice AI That Works Inside Your CRM</w:t>
+        <w:t xml:space="preserve">Trillet + GoHighLevel: A Voice Agent That Books Into Your Calendar</w:t>
       </w:r>
     </w:p>
     <w:p>
@@ -76,7 +76,7 @@
           <w:sz w:val="18"/>
           <w:szCs w:val="18"/>
         </w:rPr>
-        <w:t xml:space="preserve">. This page is the 301 target for the </w:t>
+        <w:t xml:space="preserve">. The 301 target for the </w:t>
       </w:r>
       <w:r>
         <w:rPr>
@@ -102,7 +102,32 @@
           <w:sz w:val="18"/>
           <w:szCs w:val="18"/>
         </w:rPr>
-        <w:t xml:space="preserve"> blog, so it must own that query set: a branded voice agent that reads and writes GoHighLevel contacts, fires workflows, and rebills through sub-accounts. Product-page voice, every figure reconciled to the live site, September 2026.</w:t>
+        <w:t xml:space="preserve"> blog. Reconciled to the product integration guide (25 Sep 2026): the integration is calendar booking plus contact match-or-create, connected per agent. Structure follows what ranks for the term (how it works, setup, FAQ) and the conversion order buyers read in. Every figure reconciled to the live site.</w:t>
+      </w:r>
+    </w:p>
+    <w:p>
+      <w:pPr>
+        <w:spacing w:after="40"/>
+      </w:pPr>
+      <w:r>
+        <w:rPr>
+          <w:rFonts w:ascii="Calibri" w:cs="Calibri" w:eastAsia="Calibri" w:hAnsi="Calibri"/>
+          <w:b/>
+          <w:bCs/>
+          <w:color w:val="B4442E"/>
+          <w:sz w:val="16"/>
+          <w:szCs w:val="16"/>
+        </w:rPr>
+        <w:t xml:space="preserve">⚑ </w:t>
+      </w:r>
+      <w:r>
+        <w:rPr>
+          <w:rFonts w:ascii="Calibri" w:cs="Calibri" w:eastAsia="Calibri" w:hAnsi="Calibri"/>
+          <w:color w:val="5A6675"/>
+          <w:sz w:val="16"/>
+          <w:szCs w:val="16"/>
+        </w:rPr>
+        <w:t xml:space="preserve">Corrected from the first draft: removed workflow-trigger and sub-account snapshot/rebilling claims. Neither is in the product. The integration books into a GoHighLevel calendar and matches or creates the caller's contact.</w:t>
       </w:r>
     </w:p>
     <w:p>
@@ -221,7 +246,7 @@
           <w:sz w:val="17"/>
           <w:szCs w:val="17"/>
         </w:rPr>
-        <w:t xml:space="preserve">trillet gohighlevel integration · voice ai for gohighlevel · ghl voice agent · gohighlevel voice ai for agencies · sync gohighlevel contacts voice ai · gohighlevel workflow trigger voice</w:t>
+        <w:t xml:space="preserve">gohighlevel appointment booking voice ai · voice ai for gohighlevel · ghl voice agent · book gohighlevel appointments by phone · gohighlevel ai receptionist · trillet gohighlevel integration</w:t>
       </w:r>
     </w:p>
     <w:p>
@@ -350,7 +375,7 @@
           <w:sz w:val="24"/>
           <w:szCs w:val="24"/>
         </w:rPr>
-        <w:t xml:space="preserve">GoHighLevel voice AI that lives inside your CRM</w:t>
+        <w:t xml:space="preserve">GoHighLevel voice AI that books straight into your calendar</w:t>
       </w:r>
     </w:p>
     <w:p>
@@ -381,7 +406,7 @@
           <w:sz w:val="19"/>
           <w:szCs w:val="19"/>
         </w:rPr>
-        <w:t xml:space="preserve">Connect Trillet to GoHighLevel and your voice agent works straight from live sub-account data. It reads the contact before it answers, updates the record as it talks, and fires the workflow the moment the call ends. No exported spreadsheets, no copy-paste, no missed follow-up.</w:t>
+        <w:t xml:space="preserve">Connect Trillet to GoHighLevel and your agent answers the phone, checks your calendar for real openings, and books the appointment while the caller is still on the line. It recognises returning callers, creates a contact for new ones, and can reschedule or cancel on the same call. Your calendar fills itself, day and night.</w:t>
       </w:r>
     </w:p>
     <w:p>
@@ -467,7 +492,7 @@
                 <w:sz w:val="17"/>
                 <w:szCs w:val="17"/>
               </w:rPr>
-              <w:t xml:space="preserve">A live Trillet call panel docked beside a GoHighLevel contact record: the agent is on a call with “Sarah Nguyen”, and her GHL fields (last appointment, pipeline stage, tags) update in real time as the conversation moves. Trillet branding, your agency logo, GHL clearly the CRM underneath.</w:t>
+              <w:t xml:space="preserve">A live Trillet call panel beside a GoHighLevel calendar: the agent has just offered “Thursday 2pm or Friday 10am”, the caller picks Thursday, and the appointment appears on the GoHighLevel calendar booked against the caller's contact. Your agency logo on the Trillet panel, GHL clearly the calendar underneath.</w:t>
             </w:r>
           </w:p>
         </w:tc>
@@ -623,7 +648,7 @@
                 <w:sz w:val="20"/>
                 <w:szCs w:val="20"/>
               </w:rPr>
-              <w:t xml:space="preserve">The Trillet + GoHighLevel integration lets a branded voice agent read and write GoHighLevel contacts, trigger GHL workflows from live calls, and log every conversation to the record, all at the sub-account level. Agencies build it once, save it as a snapshot, and roll it out to every client. Because Trillet runs its own telephony and compliance, you get a voice agent that is native to the CRM without paying for a HIPAA add-on.</w:t>
+              <w:t xml:space="preserve">The Trillet + GoHighLevel integration lets a voice agent book appointments into your GoHighLevel calendar during a call. It checks your calendar's real availability before it offers a time, so it never double-books, and it works within the opening hours, slot lengths and booking rules you have already set in GoHighLevel. It finds the caller's contact by email or phone, or creates one if there is no match, and books the appointment against it. On the same call it can also reschedule or cancel an existing appointment. You connect it per agent, so the agent that answers a client's phone is the one that books into that client's calendar.</w:t>
             </w:r>
           </w:p>
         </w:tc>
@@ -631,22 +656,21 @@
     </w:tbl>
     <w:p>
       <w:pPr>
-        <w:spacing w:after="110" w:line="278"/>
-      </w:pPr>
-      <w:r>
-        <w:rPr>
-          <w:rFonts w:ascii="Calibri" w:cs="Calibri" w:eastAsia="Calibri" w:hAnsi="Calibri"/>
-          <w:b w:val="false"/>
-          <w:bCs w:val="false"/>
-          <w:i w:val="false"/>
-          <w:iCs w:val="false"/>
-          <w:color w:val="24303F"/>
-          <w:sz w:val="20"/>
-          <w:szCs w:val="20"/>
-        </w:rPr>
-        <w:t xml:space="preserve">GoHighLevel is where agencies already run their pipelines, calendars and follow-up. The gap has always been the phone: someone still has to answer it, qualify the caller, and get the details back into the CRM before the lead goes cold. Trillet closes that gap. Your agent answers in your brand's voice, works from the same sub-account data your team sees, and leaves the record cleaner than a human would.</w:t>
-      </w:r>
-      <after>80</after>
+        <w:spacing w:after="80" w:line="278"/>
+      </w:pPr>
+      <w:r>
+        <w:rPr>
+          <w:rFonts w:ascii="Calibri" w:cs="Calibri" w:eastAsia="Calibri" w:hAnsi="Calibri"/>
+          <w:b w:val="false"/>
+          <w:bCs w:val="false"/>
+          <w:i w:val="false"/>
+          <w:iCs w:val="false"/>
+          <w:color w:val="24303F"/>
+          <w:sz w:val="20"/>
+          <w:szCs w:val="20"/>
+        </w:rPr>
+        <w:t xml:space="preserve">GoHighLevel already runs your pipelines, calendars and follow-up. The gap has always been the phone: someone still has to answer it and get the booking into the calendar before the caller loses patience or hangs up. Trillet answers instead, works from the same calendar your team sees, and books in real time.</w:t>
+      </w:r>
     </w:p>
     <w:p>
       <w:pPr>
@@ -661,23 +685,7 @@
           <w:sz w:val="25"/>
           <w:szCs w:val="25"/>
         </w:rPr>
-        <w:t xml:space="preserve">What you can build</w:t>
-      </w:r>
-    </w:p>
-    <w:p>
-      <w:pPr>
-        <w:spacing w:after="16" w:before="110"/>
-      </w:pPr>
-      <w:r>
-        <w:rPr>
-          <w:rFonts w:ascii="Calibri" w:cs="Calibri" w:eastAsia="Calibri" w:hAnsi="Calibri"/>
-          <w:b/>
-          <w:bCs/>
-          <w:color w:val="16223C"/>
-          <w:sz w:val="20"/>
-          <w:szCs w:val="20"/>
-        </w:rPr>
-        <w:t xml:space="preserve">Two-way contact sync</w:t>
+        <w:t xml:space="preserve">How it works on a call</w:t>
       </w:r>
     </w:p>
     <w:p>
@@ -691,11 +699,155 @@
           <w:bCs w:val="false"/>
           <w:i w:val="false"/>
           <w:iCs w:val="false"/>
-          <w:color w:val="24303F"/>
-          <w:sz w:val="20"/>
-          <w:szCs w:val="20"/>
-        </w:rPr>
-        <w:t xml:space="preserve">The agent looks up the caller in GoHighLevel before it speaks, so a returning client is greeted by name and never re-asked what they already told you. As the call runs, it writes back: it creates a contact for a new caller, updates fields on an existing one, adds tags, and attaches the recording and transcript to the record. Your CRM stays current without anyone touching a keyboard.</w:t>
+          <w:color w:val="5A6675"/>
+          <w:sz w:val="18"/>
+          <w:szCs w:val="18"/>
+        </w:rPr>
+        <w:t xml:space="preserve">Four moments, all inside one conversation. No hold music, no callback, no manual entry afterwards.</w:t>
+      </w:r>
+    </w:p>
+    <w:p>
+      <w:pPr>
+        <w:pStyle w:val="ListParagraph"/>
+        <w:numPr>
+          <w:ilvl w:val="0"/>
+          <w:numId w:val="1"/>
+        </w:numPr>
+        <w:spacing w:after="50" w:line="272"/>
+      </w:pPr>
+      <w:r>
+        <w:rPr>
+          <w:rFonts w:ascii="Calibri" w:cs="Calibri" w:eastAsia="Calibri" w:hAnsi="Calibri"/>
+          <w:b/>
+          <w:bCs/>
+          <w:i w:val="false"/>
+          <w:iCs w:val="false"/>
+          <w:color w:val="24303F"/>
+          <w:sz w:val="20"/>
+          <w:szCs w:val="20"/>
+        </w:rPr>
+        <w:t xml:space="preserve">It checks before it offers. </w:t>
+      </w:r>
+      <w:r>
+        <w:rPr>
+          <w:rFonts w:ascii="Calibri" w:cs="Calibri" w:eastAsia="Calibri" w:hAnsi="Calibri"/>
+          <w:b w:val="false"/>
+          <w:bCs w:val="false"/>
+          <w:i w:val="false"/>
+          <w:iCs w:val="false"/>
+          <w:color w:val="24303F"/>
+          <w:sz w:val="20"/>
+          <w:szCs w:val="20"/>
+        </w:rPr>
+        <w:t xml:space="preserve">The agent reads open times from your GoHighLevel calendar and only offers slots that are genuinely free, so two callers are never given the same one.</w:t>
+      </w:r>
+    </w:p>
+    <w:p>
+      <w:pPr>
+        <w:pStyle w:val="ListParagraph"/>
+        <w:numPr>
+          <w:ilvl w:val="0"/>
+          <w:numId w:val="1"/>
+        </w:numPr>
+        <w:spacing w:after="50" w:line="272"/>
+      </w:pPr>
+      <w:r>
+        <w:rPr>
+          <w:rFonts w:ascii="Calibri" w:cs="Calibri" w:eastAsia="Calibri" w:hAnsi="Calibri"/>
+          <w:b/>
+          <w:bCs/>
+          <w:i w:val="false"/>
+          <w:iCs w:val="false"/>
+          <w:color w:val="24303F"/>
+          <w:sz w:val="20"/>
+          <w:szCs w:val="20"/>
+        </w:rPr>
+        <w:t xml:space="preserve">It knows who is calling. </w:t>
+      </w:r>
+      <w:r>
+        <w:rPr>
+          <w:rFonts w:ascii="Calibri" w:cs="Calibri" w:eastAsia="Calibri" w:hAnsi="Calibri"/>
+          <w:b w:val="false"/>
+          <w:bCs w:val="false"/>
+          <w:i w:val="false"/>
+          <w:iCs w:val="false"/>
+          <w:color w:val="24303F"/>
+          <w:sz w:val="20"/>
+          <w:szCs w:val="20"/>
+        </w:rPr>
+        <w:t xml:space="preserve">It looks up the caller's contact in GoHighLevel by email or phone. A returning client is matched to their record; a new caller gets a contact created for them.</w:t>
+      </w:r>
+    </w:p>
+    <w:p>
+      <w:pPr>
+        <w:pStyle w:val="ListParagraph"/>
+        <w:numPr>
+          <w:ilvl w:val="0"/>
+          <w:numId w:val="1"/>
+        </w:numPr>
+        <w:spacing w:after="50" w:line="272"/>
+      </w:pPr>
+      <w:r>
+        <w:rPr>
+          <w:rFonts w:ascii="Calibri" w:cs="Calibri" w:eastAsia="Calibri" w:hAnsi="Calibri"/>
+          <w:b/>
+          <w:bCs/>
+          <w:i w:val="false"/>
+          <w:iCs w:val="false"/>
+          <w:color w:val="24303F"/>
+          <w:sz w:val="20"/>
+          <w:szCs w:val="20"/>
+        </w:rPr>
+        <w:t xml:space="preserve">It books against the contact. </w:t>
+      </w:r>
+      <w:r>
+        <w:rPr>
+          <w:rFonts w:ascii="Calibri" w:cs="Calibri" w:eastAsia="Calibri" w:hAnsi="Calibri"/>
+          <w:b w:val="false"/>
+          <w:bCs w:val="false"/>
+          <w:i w:val="false"/>
+          <w:iCs w:val="false"/>
+          <w:color w:val="24303F"/>
+          <w:sz w:val="20"/>
+          <w:szCs w:val="20"/>
+        </w:rPr>
+        <w:t xml:space="preserve">To book it takes the caller's first name, last name and email, then writes the appointment onto your calendar against their contact.</w:t>
+      </w:r>
+    </w:p>
+    <w:p>
+      <w:pPr>
+        <w:pStyle w:val="ListParagraph"/>
+        <w:numPr>
+          <w:ilvl w:val="0"/>
+          <w:numId w:val="1"/>
+        </w:numPr>
+        <w:spacing w:after="50" w:line="272"/>
+      </w:pPr>
+      <w:r>
+        <w:rPr>
+          <w:rFonts w:ascii="Calibri" w:cs="Calibri" w:eastAsia="Calibri" w:hAnsi="Calibri"/>
+          <w:b/>
+          <w:bCs/>
+          <w:i w:val="false"/>
+          <w:iCs w:val="false"/>
+          <w:color w:val="24303F"/>
+          <w:sz w:val="20"/>
+          <w:szCs w:val="20"/>
+        </w:rPr>
+        <w:t xml:space="preserve">It can move or cancel too. </w:t>
+      </w:r>
+      <w:r>
+        <w:rPr>
+          <w:rFonts w:ascii="Calibri" w:cs="Calibri" w:eastAsia="Calibri" w:hAnsi="Calibri"/>
+          <w:b w:val="false"/>
+          <w:bCs w:val="false"/>
+          <w:i w:val="false"/>
+          <w:iCs w:val="false"/>
+          <w:color w:val="24303F"/>
+          <w:sz w:val="20"/>
+          <w:szCs w:val="20"/>
+        </w:rPr>
+        <w:t xml:space="preserve">Give the agent the reschedule and cancel functions and a caller can change or drop an appointment on the same call, freeing the slot for the next person.</w:t>
       </w:r>
     </w:p>
     <w:tbl>
@@ -753,7 +905,7 @@
                 <w:sz w:val="17"/>
                 <w:szCs w:val="17"/>
               </w:rPr>
-              <w:t xml:space="preserve">A GoHighLevel contact timeline after a Trillet call: a new note with the transcript, a call recording attachment, updated custom fields (“Service requested: crown”, “Preferred day: Thursday”), and two new tags. All written by the agent.</w:t>
+              <w:t xml:space="preserve">A four-beat strip of one call: (1) agent reading GHL availability, (2) matching the caller to a GoHighLevel contact, (3) the new appointment written to the calendar, (4) a rescheduled event moving to a new time. The GoHighLevel calendar visible throughout.</w:t>
             </w:r>
           </w:p>
         </w:tc>
@@ -761,6 +913,22 @@
     </w:tbl>
     <w:p>
       <w:pPr>
+        <w:spacing w:after="50" w:before="170"/>
+      </w:pPr>
+      <w:r>
+        <w:rPr>
+          <w:rFonts w:ascii="Georgia" w:cs="Georgia" w:eastAsia="Georgia" w:hAnsi="Georgia"/>
+          <w:b/>
+          <w:bCs/>
+          <w:color w:val="16223C"/>
+          <w:sz w:val="25"/>
+          <w:szCs w:val="25"/>
+        </w:rPr>
+        <w:t xml:space="preserve">What you can build</w:t>
+      </w:r>
+    </w:p>
+    <w:p>
+      <w:pPr>
         <w:spacing w:after="16" w:before="110"/>
       </w:pPr>
       <w:r>
@@ -772,7 +940,7 @@
           <w:sz w:val="20"/>
           <w:szCs w:val="20"/>
         </w:rPr>
-        <w:t xml:space="preserve">Workflow triggers from live calls</w:t>
+        <w:t xml:space="preserve">A 24/7 booking line on your GoHighLevel calendar</w:t>
       </w:r>
     </w:p>
     <w:p>
@@ -790,7 +958,7 @@
           <w:sz w:val="20"/>
           <w:szCs w:val="20"/>
         </w:rPr>
-        <w:t xml:space="preserve">Every call becomes a signal your GoHighLevel automations can act on. A booked appointment fires the confirmation-and-reminder workflow. A qualified lead drops into the nurture sequence. A caller who asked for a callback moves to the right pipeline stage and pings the account owner. The agent passes the variables the workflow needs, so the automation you already built just runs.</w:t>
+        <w:t xml:space="preserve">Point the agent at your calendar and it takes bookings around the clock, at lunch, and whenever every line is busy. Because it reads your GoHighLevel calendar's own availability, opening hours, slot length and booking rules stay exactly where you set them. A missed call stops being a lost booking.</w:t>
       </w:r>
     </w:p>
     <w:p>
@@ -806,7 +974,7 @@
           <w:sz w:val="20"/>
           <w:szCs w:val="20"/>
         </w:rPr>
-        <w:t xml:space="preserve">Sub-account rollout and rebilling</w:t>
+        <w:t xml:space="preserve">Callers recognised, contacts kept tidy</w:t>
       </w:r>
     </w:p>
     <w:p>
@@ -824,7 +992,75 @@
           <w:sz w:val="20"/>
           <w:szCs w:val="20"/>
         </w:rPr>
-        <w:t xml:space="preserve">Build the agent and its GoHighLevel connection once, save it into a sub-account snapshot, and push it to every new client account you spin up. Trillet keeps each client in its own isolated workspace, so numbers, agents and data never bleed between accounts. You set your own per-minute retail price on top of the flat $0.12 a minute usage rate and keep the margin, the same recurring-revenue model agencies already run in GoHighLevel, now on the phone.</w:t>
+        <w:t xml:space="preserve">The agent matches the caller to their GoHighLevel contact by phone or email, so a returning client is not asked again for what you already hold. When someone new calls, it creates the contact and books against it, so your CRM stays current without anyone typing after the call.</w:t>
+      </w:r>
+    </w:p>
+    <w:p>
+      <w:pPr>
+        <w:spacing w:after="16" w:before="110"/>
+      </w:pPr>
+      <w:r>
+        <w:rPr>
+          <w:rFonts w:ascii="Calibri" w:cs="Calibri" w:eastAsia="Calibri" w:hAnsi="Calibri"/>
+          <w:b/>
+          <w:bCs/>
+          <w:color w:val="16223C"/>
+          <w:sz w:val="20"/>
+          <w:szCs w:val="20"/>
+        </w:rPr>
+        <w:t xml:space="preserve">Reschedules and cancellations handled by voice</w:t>
+      </w:r>
+    </w:p>
+    <w:p>
+      <w:pPr>
+        <w:spacing w:after="110" w:line="278"/>
+      </w:pPr>
+      <w:r>
+        <w:rPr>
+          <w:rFonts w:ascii="Calibri" w:cs="Calibri" w:eastAsia="Calibri" w:hAnsi="Calibri"/>
+          <w:b w:val="false"/>
+          <w:bCs w:val="false"/>
+          <w:i w:val="false"/>
+          <w:iCs w:val="false"/>
+          <w:color w:val="24303F"/>
+          <w:sz w:val="20"/>
+          <w:szCs w:val="20"/>
+        </w:rPr>
+        <w:t xml:space="preserve">Turn on the reschedule and cancel functions and the agent finds the caller's existing appointment, moves it or drops it, and frees the slot. The work that used to mean a call, a hold and a manual calendar edit finishes in one conversation.</w:t>
+      </w:r>
+    </w:p>
+    <w:p>
+      <w:pPr>
+        <w:spacing w:after="16" w:before="110"/>
+      </w:pPr>
+      <w:r>
+        <w:rPr>
+          <w:rFonts w:ascii="Calibri" w:cs="Calibri" w:eastAsia="Calibri" w:hAnsi="Calibri"/>
+          <w:b/>
+          <w:bCs/>
+          <w:color w:val="16223C"/>
+          <w:sz w:val="20"/>
+          <w:szCs w:val="20"/>
+        </w:rPr>
+        <w:t xml:space="preserve">An agent tuned to how your business books</w:t>
+      </w:r>
+    </w:p>
+    <w:p>
+      <w:pPr>
+        <w:spacing w:after="110" w:line="278"/>
+      </w:pPr>
+      <w:r>
+        <w:rPr>
+          <w:rFonts w:ascii="Calibri" w:cs="Calibri" w:eastAsia="Calibri" w:hAnsi="Calibri"/>
+          <w:b w:val="false"/>
+          <w:bCs w:val="false"/>
+          <w:i w:val="false"/>
+          <w:iCs w:val="false"/>
+          <w:color w:val="24303F"/>
+          <w:sz w:val="20"/>
+          <w:szCs w:val="20"/>
+        </w:rPr>
+        <w:t xml:space="preserve">Every function ships with Trillet's default instructions, and you can edit each one to fit your business, decide what the agent collects before it books, and set what it says while it checks availability or confirms. You choose which functions the agent has, so it does exactly what you want and nothing you do not.</w:t>
       </w:r>
     </w:p>
     <w:tbl>
@@ -882,7 +1118,7 @@
                 <w:sz w:val="17"/>
                 <w:szCs w:val="17"/>
               </w:rPr>
-              <w:t xml:space="preserve">The agency view: a list of GoHighLevel sub-accounts (Acme Dental, Harbor Law, Coastal Plumbing), each with a Trillet workspace attached, a per-minute retail price set, and a monthly margin figure beside it.</w:t>
+              <w:t xml:space="preserve">A function's settings open in Trillet: Book an appointment selected, editable Additional instructions with a Reset control and an on/off switch, a Details to include list, and a What the agent says while this runs field.</w:t>
             </w:r>
           </w:p>
         </w:tc>
@@ -919,7 +1155,7 @@
           <w:sz w:val="18"/>
           <w:szCs w:val="18"/>
         </w:rPr>
-        <w:t xml:space="preserve">Four steps, no code. Most agencies have the first client live the same afternoon.</w:t>
+        <w:t xml:space="preserve">No code. Connect the agent that takes bookings, point it at a calendar, and publish. You connect each agent to GoHighLevel separately.</w:t>
       </w:r>
     </w:p>
     <w:p>
@@ -955,7 +1191,7 @@
           <w:sz w:val="20"/>
           <w:szCs w:val="20"/>
         </w:rPr>
-        <w:t xml:space="preserve">In Trillet, open Integrations, choose GoHighLevel, and authorise the sub-account you want to connect. Trillet reads and writes only the contacts and workflows in that sub-account.</w:t>
+        <w:t xml:space="preserve">In your agent, open Advanced Settings, then Integrations, click the GoHighLevel tile and Connect. Sign in, choose the sub-account the agent should work in, and approve access. You will see “GoHighLevel connected successfully.”</w:t>
       </w:r>
     </w:p>
     <w:p>
@@ -978,20 +1214,20 @@
           <w:sz w:val="20"/>
           <w:szCs w:val="20"/>
         </w:rPr>
-        <w:t xml:space="preserve">Map your fields. </w:t>
-      </w:r>
-      <w:r>
-        <w:rPr>
-          <w:rFonts w:ascii="Calibri" w:cs="Calibri" w:eastAsia="Calibri" w:hAnsi="Calibri"/>
-          <w:b w:val="false"/>
-          <w:bCs w:val="false"/>
-          <w:i w:val="false"/>
-          <w:iCs w:val="false"/>
-          <w:color w:val="24303F"/>
-          <w:sz w:val="20"/>
-          <w:szCs w:val="20"/>
-        </w:rPr>
-        <w:t xml:space="preserve">Tell the agent which GoHighLevel fields to read before a call and which to write after it, and pick the workflows it can trigger. Templates cover reception, qualification and booking out of the box.</w:t>
+        <w:t xml:space="preserve">Find your Calendar ID. </w:t>
+      </w:r>
+      <w:r>
+        <w:rPr>
+          <w:rFonts w:ascii="Calibri" w:cs="Calibri" w:eastAsia="Calibri" w:hAnsi="Calibri"/>
+          <w:b w:val="false"/>
+          <w:bCs w:val="false"/>
+          <w:i w:val="false"/>
+          <w:iCs w:val="false"/>
+          <w:color w:val="24303F"/>
+          <w:sz w:val="20"/>
+          <w:szCs w:val="20"/>
+        </w:rPr>
+        <w:t xml:space="preserve">In GoHighLevel, go to Settings, then Calendars, open your calendar's share link, and copy the ID from the end of the booking link.</w:t>
       </w:r>
     </w:p>
     <w:p>
@@ -1014,20 +1250,20 @@
           <w:sz w:val="20"/>
           <w:szCs w:val="20"/>
         </w:rPr>
-        <w:t xml:space="preserve">Point the number. </w:t>
-      </w:r>
-      <w:r>
-        <w:rPr>
-          <w:rFonts w:ascii="Calibri" w:cs="Calibri" w:eastAsia="Calibri" w:hAnsi="Calibri"/>
-          <w:b w:val="false"/>
-          <w:bCs w:val="false"/>
-          <w:i w:val="false"/>
-          <w:iCs w:val="false"/>
-          <w:color w:val="24303F"/>
-          <w:sz w:val="20"/>
-          <w:szCs w:val="20"/>
-        </w:rPr>
-        <w:t xml:space="preserve">Use a Trillet number or forward the client's existing line. Carrier-level call forwarding goes live in about 30 seconds with no number porting.</w:t>
+        <w:t xml:space="preserve">Turn on Calendar Booking. </w:t>
+      </w:r>
+      <w:r>
+        <w:rPr>
+          <w:rFonts w:ascii="Calibri" w:cs="Calibri" w:eastAsia="Calibri" w:hAnsi="Calibri"/>
+          <w:b w:val="false"/>
+          <w:bCs w:val="false"/>
+          <w:i w:val="false"/>
+          <w:iCs w:val="false"/>
+          <w:color w:val="24303F"/>
+          <w:sz w:val="20"/>
+          <w:szCs w:val="20"/>
+        </w:rPr>
+        <w:t xml:space="preserve">Back in the GoHighLevel integration settings, switch on Calendar Booking, paste in the Calendar ID, and set Agent Location (Timezone) to match your GoHighLevel calendar. The timezone is required; bookings will not work without it.</w:t>
       </w:r>
     </w:p>
     <w:p>
@@ -1050,20 +1286,20 @@
           <w:sz w:val="20"/>
           <w:szCs w:val="20"/>
         </w:rPr>
-        <w:t xml:space="preserve">Snapshot and roll out. </w:t>
-      </w:r>
-      <w:r>
-        <w:rPr>
-          <w:rFonts w:ascii="Calibri" w:cs="Calibri" w:eastAsia="Calibri" w:hAnsi="Calibri"/>
-          <w:b w:val="false"/>
-          <w:bCs w:val="false"/>
-          <w:i w:val="false"/>
-          <w:iCs w:val="false"/>
-          <w:color w:val="24303F"/>
-          <w:sz w:val="20"/>
-          <w:szCs w:val="20"/>
-        </w:rPr>
-        <w:t xml:space="preserve">Save the configured agent into a sub-account snapshot and apply it to every new client account. One build, every client.</w:t>
+        <w:t xml:space="preserve">Choose the functions and publish. </w:t>
+      </w:r>
+      <w:r>
+        <w:rPr>
+          <w:rFonts w:ascii="Calibri" w:cs="Calibri" w:eastAsia="Calibri" w:hAnsi="Calibri"/>
+          <w:b w:val="false"/>
+          <w:bCs w:val="false"/>
+          <w:i w:val="false"/>
+          <w:iCs w:val="false"/>
+          <w:color w:val="24303F"/>
+          <w:sz w:val="20"/>
+          <w:szCs w:val="20"/>
+        </w:rPr>
+        <w:t xml:space="preserve">Under Functions, add what the agent can do: check availability, book, reschedule and cancel. Click Done, then Publish Changes. Nothing reaches live calls until you publish.</w:t>
       </w:r>
     </w:p>
     <w:tbl>
@@ -1121,7 +1357,7 @@
                 <w:sz w:val="17"/>
                 <w:szCs w:val="17"/>
               </w:rPr>
-              <w:t xml:space="preserve">The Trillet Integrations screen mid-setup: GoHighLevel connected with a green tick, a field-mapping table (GHL field → agent variable), and a workflow picker with three GHL workflows selected.</w:t>
+              <w:t xml:space="preserve">The Trillet GoHighLevel integration screen after setup: connected with a green tick, Calendar Booking on, a Calendar ID pasted in, Agent Location (Timezone) set, and all four functions marked Added.</w:t>
             </w:r>
           </w:p>
         </w:tc>
@@ -1140,7 +1376,7 @@
           <w:sz w:val="25"/>
           <w:szCs w:val="25"/>
         </w:rPr>
-        <w:t xml:space="preserve">Why agencies run Trillet on GoHighLevel</w:t>
+        <w:t xml:space="preserve">Why agencies and teams run Trillet on GoHighLevel</w:t>
       </w:r>
     </w:p>
     <w:p>
@@ -1176,7 +1412,7 @@
           <w:sz w:val="20"/>
           <w:szCs w:val="20"/>
         </w:rPr>
-        <w:t xml:space="preserve">GoHighLevel charges for HIPAA as an add-on with per-sub-account setup. Trillet includes SOC 2 Type II, ISO 27001, HIPAA, GDPR, ACMA and TCPA on every plan, with audit trails and a recording and transcript of every call.</w:t>
+        <w:t xml:space="preserve">GoHighLevel charges for HIPAA as an add-on. Trillet includes SOC 2 Type II, ISO 27001, HIPAA, GDPR, ACMA and TCPA on every plan, with audit trails and a recording and transcript of every call.</w:t>
       </w:r>
     </w:p>
     <w:p>
@@ -1235,20 +1471,20 @@
           <w:sz w:val="20"/>
           <w:szCs w:val="20"/>
         </w:rPr>
-        <w:t xml:space="preserve">Isolated per client. </w:t>
-      </w:r>
-      <w:r>
-        <w:rPr>
-          <w:rFonts w:ascii="Calibri" w:cs="Calibri" w:eastAsia="Calibri" w:hAnsi="Calibri"/>
-          <w:b w:val="false"/>
-          <w:bCs w:val="false"/>
-          <w:i w:val="false"/>
-          <w:iCs w:val="false"/>
-          <w:color w:val="24303F"/>
-          <w:sz w:val="20"/>
-          <w:szCs w:val="20"/>
-        </w:rPr>
-        <w:t xml:space="preserve">Every sub-account maps to its own Trillet workspace. Numbers, agents and data stay separate, which is what regulated clients ask about first.</w:t>
+        <w:t xml:space="preserve">Your calendar rules stay in GoHighLevel. </w:t>
+      </w:r>
+      <w:r>
+        <w:rPr>
+          <w:rFonts w:ascii="Calibri" w:cs="Calibri" w:eastAsia="Calibri" w:hAnsi="Calibri"/>
+          <w:b w:val="false"/>
+          <w:bCs w:val="false"/>
+          <w:i w:val="false"/>
+          <w:iCs w:val="false"/>
+          <w:color w:val="24303F"/>
+          <w:sz w:val="20"/>
+          <w:szCs w:val="20"/>
+        </w:rPr>
+        <w:t xml:space="preserve">The agent books within your existing availability, slot lengths and rules. You change how you book in GoHighLevel, the way you always have.</w:t>
       </w:r>
     </w:p>
     <w:p>
@@ -1271,20 +1507,86 @@
           <w:sz w:val="20"/>
           <w:szCs w:val="20"/>
         </w:rPr>
-        <w:t xml:space="preserve">You keep the margin. </w:t>
-      </w:r>
-      <w:r>
-        <w:rPr>
-          <w:rFonts w:ascii="Calibri" w:cs="Calibri" w:eastAsia="Calibri" w:hAnsi="Calibri"/>
-          <w:b w:val="false"/>
-          <w:bCs w:val="false"/>
-          <w:i w:val="false"/>
-          <w:iCs w:val="false"/>
-          <w:color w:val="24303F"/>
-          <w:sz w:val="20"/>
-          <w:szCs w:val="20"/>
-        </w:rPr>
-        <w:t xml:space="preserve">Flat $0.12 a minute usage, your retail price on top, billed through the same client relationship you already own in GoHighLevel.</w:t>
+        <w:t xml:space="preserve">Keep your number. </w:t>
+      </w:r>
+      <w:r>
+        <w:rPr>
+          <w:rFonts w:ascii="Calibri" w:cs="Calibri" w:eastAsia="Calibri" w:hAnsi="Calibri"/>
+          <w:b w:val="false"/>
+          <w:bCs w:val="false"/>
+          <w:i w:val="false"/>
+          <w:iCs w:val="false"/>
+          <w:color w:val="24303F"/>
+          <w:sz w:val="20"/>
+          <w:szCs w:val="20"/>
+        </w:rPr>
+        <w:t xml:space="preserve">Use a Trillet number or forward your existing line. Carrier-level call forwarding goes live in about 30 seconds with no porting.</w:t>
+      </w:r>
+    </w:p>
+    <w:p>
+      <w:pPr>
+        <w:spacing w:after="50" w:before="170"/>
+      </w:pPr>
+      <w:r>
+        <w:rPr>
+          <w:rFonts w:ascii="Georgia" w:cs="Georgia" w:eastAsia="Georgia" w:hAnsi="Georgia"/>
+          <w:b/>
+          <w:bCs/>
+          <w:color w:val="16223C"/>
+          <w:sz w:val="25"/>
+          <w:szCs w:val="25"/>
+        </w:rPr>
+        <w:t xml:space="preserve">Running this for clients</w:t>
+      </w:r>
+    </w:p>
+    <w:p>
+      <w:pPr>
+        <w:spacing w:after="110" w:line="278"/>
+      </w:pPr>
+      <w:r>
+        <w:rPr>
+          <w:rFonts w:ascii="Calibri" w:cs="Calibri" w:eastAsia="Calibri" w:hAnsi="Calibri"/>
+          <w:b w:val="false"/>
+          <w:bCs w:val="false"/>
+          <w:i w:val="false"/>
+          <w:iCs w:val="false"/>
+          <w:color w:val="24303F"/>
+          <w:sz w:val="20"/>
+          <w:szCs w:val="20"/>
+        </w:rPr>
+        <w:t xml:space="preserve">Agencies whose clients live in GoHighLevel connect one Trillet agent per client, each in its own isolated workspace. To sell the whole platform under your own brand, with your domain, dashboard and pricing, see the </w:t>
+      </w:r>
+      <w:r>
+        <w:rPr>
+          <w:rFonts w:ascii="Calibri" w:cs="Calibri" w:eastAsia="Calibri" w:hAnsi="Calibri"/>
+          <w:color w:val="1B5E86"/>
+          <w:sz w:val="20"/>
+          <w:szCs w:val="20"/>
+          <w:u w:val="single"/>
+        </w:rPr>
+        <w:t xml:space="preserve">white-label voice AI platform</w:t>
+      </w:r>
+      <w:r>
+        <w:rPr>
+          <w:rFonts w:ascii="Consolas" w:cs="Consolas" w:eastAsia="Consolas" w:hAnsi="Consolas"/>
+          <w:color w:val="5A6675"/>
+          <w:sz w:val="12"/>
+          <w:szCs w:val="12"/>
+        </w:rPr>
+        <w:t xml:space="preserve"> [/whitelabel]</w:t>
+      </w:r>
+      <w:r>
+        <w:rPr>
+          <w:rFonts w:ascii="Calibri" w:cs="Calibri" w:eastAsia="Calibri" w:hAnsi="Calibri"/>
+          <w:b w:val="false"/>
+          <w:bCs w:val="false"/>
+          <w:i w:val="false"/>
+          <w:iCs w:val="false"/>
+          <w:color w:val="24303F"/>
+          <w:sz w:val="20"/>
+          <w:szCs w:val="20"/>
+        </w:rPr>
+        <w:t xml:space="preserve">.</w:t>
       </w:r>
     </w:p>
     <w:p>
@@ -1955,7 +2257,7 @@
           <w:sz w:val="20"/>
           <w:szCs w:val="20"/>
         </w:rPr>
-        <w:t xml:space="preserve">Yes. GoHighLevel is a native Trillet integration, alongside Google Calendar and Cal.com, plus webhook and API. You connect a sub-account from the Integrations screen; there is no middleware to maintain.</w:t>
+        <w:t xml:space="preserve">Yes. GoHighLevel is a native Trillet integration, alongside Google Calendar and Cal.com, plus webhook and API. You connect it from the agent that takes bookings; there is no middleware to maintain.</w:t>
       </w:r>
     </w:p>
     <w:p>
@@ -1971,7 +2273,7 @@
           <w:sz w:val="20"/>
           <w:szCs w:val="20"/>
         </w:rPr>
-        <w:t xml:space="preserve">Can the voice agent update GoHighLevel contacts?</w:t>
+        <w:t xml:space="preserve">What can the voice agent do in GoHighLevel?</w:t>
       </w:r>
     </w:p>
     <w:p>
@@ -1989,7 +2291,7 @@
           <w:sz w:val="20"/>
           <w:szCs w:val="20"/>
         </w:rPr>
-        <w:t xml:space="preserve">Yes. The agent reads the contact before the call and writes back during and after it: it creates or updates the record, adds tags, sets custom fields, and attaches the recording and transcript.</w:t>
+        <w:t xml:space="preserve">It books appointments into your GoHighLevel calendar during a call, and can reschedule or cancel them. It checks your calendar's real availability first, and finds or creates the caller's contact to book against.</w:t>
       </w:r>
     </w:p>
     <w:p>
@@ -2005,7 +2307,7 @@
           <w:sz w:val="20"/>
           <w:szCs w:val="20"/>
         </w:rPr>
-        <w:t xml:space="preserve">Can a call trigger a GoHighLevel workflow?</w:t>
+        <w:t xml:space="preserve">How does it avoid double bookings?</w:t>
       </w:r>
     </w:p>
     <w:p>
@@ -2023,7 +2325,7 @@
           <w:sz w:val="20"/>
           <w:szCs w:val="20"/>
         </w:rPr>
-        <w:t xml:space="preserve">Yes. The agent passes the variables your automation needs, so a booking, a qualified lead or a callback request can fire the GHL workflow you have already built, in real time as the call ends.</w:t>
+        <w:t xml:space="preserve">It reads open times from your GoHighLevel calendar at the moment of the call and only offers slots that are free, working within the opening hours, slot lengths and booking rules you set in GoHighLevel.</w:t>
       </w:r>
     </w:p>
     <w:p>
@@ -2039,7 +2341,7 @@
           <w:sz w:val="20"/>
           <w:szCs w:val="20"/>
         </w:rPr>
-        <w:t xml:space="preserve">Does it work across sub-accounts for my agency?</w:t>
+        <w:t xml:space="preserve">Does it create or find the caller's contact?</w:t>
       </w:r>
     </w:p>
     <w:p>
@@ -2057,7 +2359,7 @@
           <w:sz w:val="20"/>
           <w:szCs w:val="20"/>
         </w:rPr>
-        <w:t xml:space="preserve">Yes. Configure the agent once, save it into a sub-account snapshot, and roll it out to every client account. Each client runs in its own isolated Trillet workspace.</w:t>
+        <w:t xml:space="preserve">Yes. It looks up the caller by email or phone and matches them to their GoHighLevel contact, or creates one if there is no match, then books the appointment against it.</w:t>
       </w:r>
     </w:p>
     <w:p>
@@ -2073,6 +2375,40 @@
           <w:sz w:val="20"/>
           <w:szCs w:val="20"/>
         </w:rPr>
+        <w:t xml:space="preserve">Do I connect it once for my whole account?</w:t>
+      </w:r>
+    </w:p>
+    <w:p>
+      <w:pPr>
+        <w:spacing w:after="110" w:line="278"/>
+      </w:pPr>
+      <w:r>
+        <w:rPr>
+          <w:rFonts w:ascii="Calibri" w:cs="Calibri" w:eastAsia="Calibri" w:hAnsi="Calibri"/>
+          <w:b w:val="false"/>
+          <w:bCs w:val="false"/>
+          <w:i w:val="false"/>
+          <w:iCs w:val="false"/>
+          <w:color w:val="24303F"/>
+          <w:sz w:val="20"/>
+          <w:szCs w:val="20"/>
+        </w:rPr>
+        <w:t xml:space="preserve">You connect it per agent. Each agent has its own connection, so the agent that answers a given client's phone is the one that books into that client's calendar and sub-account.</w:t>
+      </w:r>
+    </w:p>
+    <w:p>
+      <w:pPr>
+        <w:spacing w:after="16" w:before="110"/>
+      </w:pPr>
+      <w:r>
+        <w:rPr>
+          <w:rFonts w:ascii="Calibri" w:cs="Calibri" w:eastAsia="Calibri" w:hAnsi="Calibri"/>
+          <w:b/>
+          <w:bCs/>
+          <w:color w:val="16223C"/>
+          <w:sz w:val="20"/>
+          <w:szCs w:val="20"/>
+        </w:rPr>
         <w:t xml:space="preserve">Is it HIPAA compliant for healthcare clients?</w:t>
       </w:r>
     </w:p>
@@ -2126,40 +2462,6 @@
           <w:szCs w:val="20"/>
         </w:rPr>
         <w:t xml:space="preserve">No. Use a Trillet number or forward the client's existing line. Carrier-level call forwarding goes live in about 30 seconds with no porting.</w:t>
-      </w:r>
-    </w:p>
-    <w:p>
-      <w:pPr>
-        <w:spacing w:after="16" w:before="110"/>
-      </w:pPr>
-      <w:r>
-        <w:rPr>
-          <w:rFonts w:ascii="Calibri" w:cs="Calibri" w:eastAsia="Calibri" w:hAnsi="Calibri"/>
-          <w:b/>
-          <w:bCs/>
-          <w:color w:val="16223C"/>
-          <w:sz w:val="20"/>
-          <w:szCs w:val="20"/>
-        </w:rPr>
-        <w:t xml:space="preserve">How do I make money reselling this?</w:t>
-      </w:r>
-    </w:p>
-    <w:p>
-      <w:pPr>
-        <w:spacing w:after="110" w:line="278"/>
-      </w:pPr>
-      <w:r>
-        <w:rPr>
-          <w:rFonts w:ascii="Calibri" w:cs="Calibri" w:eastAsia="Calibri" w:hAnsi="Calibri"/>
-          <w:b w:val="false"/>
-          <w:bCs w:val="false"/>
-          <w:i w:val="false"/>
-          <w:iCs w:val="false"/>
-          <w:color w:val="24303F"/>
-          <w:sz w:val="20"/>
-          <w:szCs w:val="20"/>
-        </w:rPr>
-        <w:t xml:space="preserve">You set your own per-minute retail price above the flat $0.12 a minute usage rate and keep the difference every month, billed through the client relationship you already own in GoHighLevel.</w:t>
       </w:r>
     </w:p>
     <w:p>
@@ -2194,7 +2496,7 @@
           <w:sz w:val="14"/>
           <w:szCs w:val="14"/>
         </w:rPr>
-        <w:t xml:space="preserve">SECTION 9 · FINAL CTA</w:t>
+        <w:t xml:space="preserve">SECTION 11 · FINAL CTA</w:t>
       </w:r>
     </w:p>
     <w:p>
@@ -2225,7 +2527,7 @@
           <w:sz w:val="22"/>
           <w:szCs w:val="22"/>
         </w:rPr>
-        <w:t xml:space="preserve">Put a voice agent inside every GoHighLevel account you run</w:t>
+        <w:t xml:space="preserve">Let your GoHighLevel calendar book itself</w:t>
       </w:r>
     </w:p>
     <w:p>
@@ -2243,7 +2545,7 @@
           <w:sz w:val="20"/>
           <w:szCs w:val="20"/>
         </w:rPr>
-        <w:t xml:space="preserve">Connect your first sub-account today, or sell the whole platform under your own brand from the </w:t>
+        <w:t xml:space="preserve">Connect an agent today, or sell the whole platform under your own brand from the </w:t>
       </w:r>
       <w:r>
         <w:rPr>
@@ -2380,7 +2682,7 @@
           <w:sz w:val="20"/>
           <w:szCs w:val="20"/>
         </w:rPr>
-        <w:t xml:space="preserve">Meta description  (147)</w:t>
+        <w:t xml:space="preserve">Meta description  (146)</w:t>
       </w:r>
     </w:p>
     <w:p>
@@ -2398,7 +2700,7 @@
           <w:sz w:val="15"/>
           <w:szCs w:val="15"/>
         </w:rPr>
-        <w:t xml:space="preserve">Connect Trillet voice AI to GoHighLevel. Sync contacts, trigger workflows and rebill across sub-accounts, with HIPAA compliance included on every plan.</w:t>
+        <w:t xml:space="preserve">Connect Trillet voice AI to GoHighLevel. Your agent books, reschedules and cancels in your calendar on the call, with HIPAA compliance on every plan.</w:t>
       </w:r>
     </w:p>
     <w:p>
@@ -2612,7 +2914,7 @@
                 <w:sz w:val="13"/>
                 <w:szCs w:val="13"/>
               </w:rPr>
-              <w:t xml:space="preserve">    {"@type":"HowToStep","name":"Map your fields"},</w:t>
+              <w:t xml:space="preserve">    {"@type":"HowToStep","name":"Find your Calendar ID"},</w:t>
             </w:r>
           </w:p>
           <w:p>
@@ -2626,7 +2928,7 @@
                 <w:sz w:val="13"/>
                 <w:szCs w:val="13"/>
               </w:rPr>
-              <w:t xml:space="preserve">    {"@type":"HowToStep","name":"Point the number"},</w:t>
+              <w:t xml:space="preserve">    {"@type":"HowToStep","name":"Turn on Calendar Booking"},</w:t>
             </w:r>
           </w:p>
           <w:p>
@@ -2640,7 +2942,7 @@
                 <w:sz w:val="13"/>
                 <w:szCs w:val="13"/>
               </w:rPr>
-              <w:t xml:space="preserve">    {"@type":"HowToStep","name":"Snapshot and roll out"}]},</w:t>
+              <w:t xml:space="preserve">    {"@type":"HowToStep","name":"Choose the functions and publish"}]},</w:t>
             </w:r>
           </w:p>
           <w:p>

</xml_diff>

<commit_message>
Add GoHighLevel HTML design render; clean doc, add design notes
Strip rationale and prior-version commentary from the GoHighLevel page
spec; add a Design language section and labelled DESIGN NOTE callouts
(new dnote helper) for each section's treatment. Add a self-contained
HTML render of the page in Trillet's design language (navy/bronze,
serif display, compliance strip, timeline, stepper, plan cards,
accordion FAQ) as a visual reference. Zero em-dashes in both.

Co-Authored-By: Claude Opus 4.8 <noreply@anthropic.com>
Claude-Session: https://claude.ai/code/session_01UhVChLeNNjFDr6eASTMGhh
</commit_message>
<xml_diff>
--- a/seo-audit/Trillet-Integration-GoHighLevel.docx
+++ b/seo-audit/Trillet-Integration-GoHighLevel.docx
@@ -50,7 +50,7 @@
           <w:sz w:val="18"/>
           <w:szCs w:val="18"/>
         </w:rPr>
-        <w:t xml:space="preserve">Build spec for </w:t>
+        <w:t xml:space="preserve">Copy-and-structure spec for </w:t>
       </w:r>
       <w:r>
         <w:rPr>
@@ -76,58 +76,7 @@
           <w:sz w:val="18"/>
           <w:szCs w:val="18"/>
         </w:rPr>
-        <w:t xml:space="preserve">. The 301 target for the </w:t>
-      </w:r>
-      <w:r>
-        <w:rPr>
-          <w:rFonts w:ascii="Consolas" w:cs="Consolas" w:eastAsia="Consolas" w:hAnsi="Consolas"/>
-          <w:b w:val="false"/>
-          <w:bCs w:val="false"/>
-          <w:i w:val="false"/>
-          <w:iCs w:val="false"/>
-          <w:color w:val="5A6675"/>
-          <w:sz w:val="15"/>
-          <w:szCs w:val="15"/>
-        </w:rPr>
-        <w:t xml:space="preserve">gohighlevel-voice-ai-integration</w:t>
-      </w:r>
-      <w:r>
-        <w:rPr>
-          <w:rFonts w:ascii="Calibri" w:cs="Calibri" w:eastAsia="Calibri" w:hAnsi="Calibri"/>
-          <w:b w:val="false"/>
-          <w:bCs w:val="false"/>
-          <w:i w:val="false"/>
-          <w:iCs w:val="false"/>
-          <w:color w:val="5A6675"/>
-          <w:sz w:val="18"/>
-          <w:szCs w:val="18"/>
-        </w:rPr>
-        <w:t xml:space="preserve"> blog. Reconciled to the product integration guide (25 Sep 2026): the integration is calendar booking plus contact match-or-create, connected per agent. Structure follows what ranks for the term (how it works, setup, FAQ) and the conversion order buyers read in. Every figure reconciled to the live site.</w:t>
-      </w:r>
-    </w:p>
-    <w:p>
-      <w:pPr>
-        <w:spacing w:after="40"/>
-      </w:pPr>
-      <w:r>
-        <w:rPr>
-          <w:rFonts w:ascii="Calibri" w:cs="Calibri" w:eastAsia="Calibri" w:hAnsi="Calibri"/>
-          <w:b/>
-          <w:bCs/>
-          <w:color w:val="B4442E"/>
-          <w:sz w:val="16"/>
-          <w:szCs w:val="16"/>
-        </w:rPr>
-        <w:t xml:space="preserve">⚑ </w:t>
-      </w:r>
-      <w:r>
-        <w:rPr>
-          <w:rFonts w:ascii="Calibri" w:cs="Calibri" w:eastAsia="Calibri" w:hAnsi="Calibri"/>
-          <w:color w:val="5A6675"/>
-          <w:sz w:val="16"/>
-          <w:szCs w:val="16"/>
-        </w:rPr>
-        <w:t xml:space="preserve">Corrected from the first draft: removed workflow-trigger and sub-account snapshot/rebilling claims. Neither is in the product. The integration books into a GoHighLevel calendar and matches or creates the caller's contact.</w:t>
+        <w:t xml:space="preserve">, with design notes for the build. The integration books appointments into a GoHighLevel calendar during a call and matches or creates the caller's contact. Connected per agent. Every figure reconciled to the live site.</w:t>
       </w:r>
     </w:p>
     <w:p>
@@ -303,6 +252,220 @@
         <w:t xml:space="preserve">Product page. Second person, outcome-led, concrete. Australian spelling, zero em-dashes, no founder story.</w:t>
       </w:r>
     </w:p>
+    <w:p>
+      <w:pPr>
+        <w:pBdr>
+          <w:bottom w:val="single" w:color="D9DEE8" w:sz="6"/>
+        </w:pBdr>
+        <w:spacing w:after="120" w:before="120"/>
+      </w:pPr>
+      <w:r>
+        <w:t xml:space="preserve"/>
+      </w:r>
+    </w:p>
+    <w:p>
+      <w:pPr>
+        <w:spacing w:after="50" w:before="170"/>
+      </w:pPr>
+      <w:r>
+        <w:rPr>
+          <w:rFonts w:ascii="Georgia" w:cs="Georgia" w:eastAsia="Georgia" w:hAnsi="Georgia"/>
+          <w:b/>
+          <w:bCs/>
+          <w:color w:val="16223C"/>
+          <w:sz w:val="25"/>
+          <w:szCs w:val="25"/>
+        </w:rPr>
+        <w:t xml:space="preserve">Design language</w:t>
+      </w:r>
+    </w:p>
+    <w:p>
+      <w:pPr>
+        <w:spacing w:after="110" w:line="278"/>
+      </w:pPr>
+      <w:r>
+        <w:rPr>
+          <w:rFonts w:ascii="Calibri" w:cs="Calibri" w:eastAsia="Calibri" w:hAnsi="Calibri"/>
+          <w:b w:val="false"/>
+          <w:bCs w:val="false"/>
+          <w:i w:val="false"/>
+          <w:iCs w:val="false"/>
+          <w:color w:val="24303F"/>
+          <w:sz w:val="18"/>
+          <w:szCs w:val="18"/>
+        </w:rPr>
+        <w:t xml:space="preserve">Trillet's look: deep navy, a bronze accent, generous white space, and compliance worn openly. The HTML render supplied alongside this doc shows the page built to these rules; the DESIGN NOTE callouts below mark the treatment for each section.</w:t>
+      </w:r>
+    </w:p>
+    <w:p>
+      <w:pPr>
+        <w:spacing w:after="26"/>
+      </w:pPr>
+      <w:r>
+        <w:rPr>
+          <w:rFonts w:ascii="Consolas" w:cs="Consolas" w:eastAsia="Consolas" w:hAnsi="Consolas"/>
+          <w:b/>
+          <w:bCs/>
+          <w:color w:val="9A6B3F"/>
+          <w:sz w:val="14"/>
+          <w:szCs w:val="14"/>
+        </w:rPr>
+        <w:t xml:space="preserve">PALETTE   </w:t>
+      </w:r>
+      <w:r>
+        <w:rPr>
+          <w:rFonts w:ascii="Consolas" w:cs="Consolas" w:eastAsia="Consolas" w:hAnsi="Consolas"/>
+          <w:b w:val="false"/>
+          <w:bCs w:val="false"/>
+          <w:color w:val="24303F"/>
+          <w:sz w:val="13"/>
+          <w:szCs w:val="13"/>
+        </w:rPr>
+        <w:t xml:space="preserve">Navy #16223C (dark bands, headings) · Bronze #9A6B3F (eyebrows, rules, secondary CTA) · Ink #24303F (body) · Muted #5A6675 (support text) · Green #2E7D5B (compliance ticks) · Rule #D9DEE8 (borders) · backgrounds white and #F7F8FA</w:t>
+      </w:r>
+    </w:p>
+    <w:p>
+      <w:pPr>
+        <w:spacing w:after="26"/>
+      </w:pPr>
+      <w:r>
+        <w:rPr>
+          <w:rFonts w:ascii="Consolas" w:cs="Consolas" w:eastAsia="Consolas" w:hAnsi="Consolas"/>
+          <w:b/>
+          <w:bCs/>
+          <w:color w:val="9A6B3F"/>
+          <w:sz w:val="14"/>
+          <w:szCs w:val="14"/>
+        </w:rPr>
+        <w:t xml:space="preserve">TYPE   </w:t>
+      </w:r>
+      <w:r>
+        <w:rPr>
+          <w:rFonts w:ascii="Calibri" w:cs="Calibri" w:eastAsia="Calibri" w:hAnsi="Calibri"/>
+          <w:b w:val="false"/>
+          <w:bCs w:val="false"/>
+          <w:color w:val="24303F"/>
+          <w:sz w:val="17"/>
+          <w:szCs w:val="17"/>
+        </w:rPr>
+        <w:t xml:space="preserve">Serif display for H1/H2 (Georgia family); clean sans for body and UI (Inter/Calibri family); mono for eyebrows and labels.</w:t>
+      </w:r>
+    </w:p>
+    <w:p>
+      <w:pPr>
+        <w:spacing w:after="26"/>
+      </w:pPr>
+      <w:r>
+        <w:rPr>
+          <w:rFonts w:ascii="Consolas" w:cs="Consolas" w:eastAsia="Consolas" w:hAnsi="Consolas"/>
+          <w:b/>
+          <w:bCs/>
+          <w:color w:val="9A6B3F"/>
+          <w:sz w:val="14"/>
+          <w:szCs w:val="14"/>
+        </w:rPr>
+        <w:t xml:space="preserve">COMPONENTS   </w:t>
+      </w:r>
+      <w:r>
+        <w:rPr>
+          <w:rFonts w:ascii="Calibri" w:cs="Calibri" w:eastAsia="Calibri" w:hAnsi="Calibri"/>
+          <w:b w:val="false"/>
+          <w:bCs w:val="false"/>
+          <w:color w:val="24303F"/>
+          <w:sz w:val="17"/>
+          <w:szCs w:val="17"/>
+        </w:rPr>
+        <w:t xml:space="preserve">Rounded cards with a hairline border and soft shadow; a mono eyebrow above each section H2; bronze hairline rules; navy hero and closing bands; a compliance badge row; two-up plan cards; an accordion FAQ.</w:t>
+      </w:r>
+    </w:p>
+    <w:p>
+      <w:pPr>
+        <w:spacing w:after="26"/>
+      </w:pPr>
+      <w:r>
+        <w:rPr>
+          <w:rFonts w:ascii="Consolas" w:cs="Consolas" w:eastAsia="Consolas" w:hAnsi="Consolas"/>
+          <w:b/>
+          <w:bCs/>
+          <w:color w:val="9A6B3F"/>
+          <w:sz w:val="14"/>
+          <w:szCs w:val="14"/>
+        </w:rPr>
+        <w:t xml:space="preserve">MOTION   </w:t>
+      </w:r>
+      <w:r>
+        <w:rPr>
+          <w:rFonts w:ascii="Calibri" w:cs="Calibri" w:eastAsia="Calibri" w:hAnsi="Calibri"/>
+          <w:b w:val="false"/>
+          <w:bCs w:val="false"/>
+          <w:color w:val="24303F"/>
+          <w:sz w:val="17"/>
+          <w:szCs w:val="17"/>
+        </w:rPr>
+        <w:t xml:space="preserve">Restrained. The hero call-and-calendar visual may animate a slot being offered then booked. Everything else static or a gentle fade on scroll.</w:t>
+      </w:r>
+    </w:p>
+    <w:tbl>
+      <w:tblPr>
+        <w:tblW w:type="dxa" w:w="9360"/>
+        <w:tblBorders>
+          <w:top w:val="none"/>
+          <w:left w:val="single" w:color="16223C" w:sz="18"/>
+          <w:bottom w:val="none"/>
+          <w:right w:val="none"/>
+          <w:insideH w:val="single" w:color="auto" w:sz="4"/>
+          <w:insideV w:val="single" w:color="auto" w:sz="4"/>
+        </w:tblBorders>
+      </w:tblPr>
+      <w:tblGrid>
+        <w:gridCol w:w="9360"/>
+      </w:tblGrid>
+      <w:tr>
+        <w:tc>
+          <w:tcPr>
+            <w:tcW w:type="dxa" w:w="9360"/>
+            <w:tcBorders>
+              <w:top w:val="none"/>
+              <w:left w:val="single" w:color="16223C" w:sz="18"/>
+              <w:bottom w:val="none"/>
+              <w:right w:val="none"/>
+            </w:tcBorders>
+            <w:shd w:fill="EDF0F6" w:color="auto" w:val="clear"/>
+            <w:tcMar>
+              <w:top w:type="dxa" w:w="90"/>
+              <w:left w:type="dxa" w:w="150"/>
+              <w:bottom w:type="dxa" w:w="90"/>
+              <w:right w:type="dxa" w:w="150"/>
+            </w:tcMar>
+          </w:tcPr>
+          <w:p>
+            <w:pPr>
+              <w:spacing w:after="0" w:line="264"/>
+            </w:pPr>
+            <w:r>
+              <w:rPr>
+                <w:rFonts w:ascii="Consolas" w:cs="Consolas" w:eastAsia="Consolas" w:hAnsi="Consolas"/>
+                <w:b/>
+                <w:bCs/>
+                <w:color w:val="16223C"/>
+                <w:sz w:val="13"/>
+                <w:szCs w:val="13"/>
+              </w:rPr>
+              <w:t xml:space="preserve">DESIGN NOTE.  </w:t>
+            </w:r>
+            <w:r>
+              <w:rPr>
+                <w:rFonts w:ascii="Calibri" w:cs="Calibri" w:eastAsia="Calibri" w:hAnsi="Calibri"/>
+                <w:color w:val="24303F"/>
+                <w:sz w:val="17"/>
+                <w:szCs w:val="17"/>
+              </w:rPr>
+              <w:t xml:space="preserve">Ship the page light (white and #F7F8FA sections) with two navy full-bleed bands: the hero backdrop and the closing CTA. Keep one bronze accent per section at most, so it reads premium rather than busy.</w:t>
+            </w:r>
+          </w:p>
+        </w:tc>
+      </w:tr>
+    </w:tbl>
     <w:p>
       <w:pPr>
         <w:pBdr>
@@ -437,6 +600,67 @@
         <w:t xml:space="preserve">    Book a demo</w:t>
       </w:r>
     </w:p>
+    <w:tbl>
+      <w:tblPr>
+        <w:tblW w:type="dxa" w:w="9360"/>
+        <w:tblBorders>
+          <w:top w:val="none"/>
+          <w:left w:val="single" w:color="16223C" w:sz="18"/>
+          <w:bottom w:val="none"/>
+          <w:right w:val="none"/>
+          <w:insideH w:val="single" w:color="auto" w:sz="4"/>
+          <w:insideV w:val="single" w:color="auto" w:sz="4"/>
+        </w:tblBorders>
+      </w:tblPr>
+      <w:tblGrid>
+        <w:gridCol w:w="9360"/>
+      </w:tblGrid>
+      <w:tr>
+        <w:tc>
+          <w:tcPr>
+            <w:tcW w:type="dxa" w:w="9360"/>
+            <w:tcBorders>
+              <w:top w:val="none"/>
+              <w:left w:val="single" w:color="16223C" w:sz="18"/>
+              <w:bottom w:val="none"/>
+              <w:right w:val="none"/>
+            </w:tcBorders>
+            <w:shd w:fill="EDF0F6" w:color="auto" w:val="clear"/>
+            <w:tcMar>
+              <w:top w:type="dxa" w:w="90"/>
+              <w:left w:type="dxa" w:w="150"/>
+              <w:bottom w:type="dxa" w:w="90"/>
+              <w:right w:type="dxa" w:w="150"/>
+            </w:tcMar>
+          </w:tcPr>
+          <w:p>
+            <w:pPr>
+              <w:spacing w:after="0" w:line="264"/>
+            </w:pPr>
+            <w:r>
+              <w:rPr>
+                <w:rFonts w:ascii="Consolas" w:cs="Consolas" w:eastAsia="Consolas" w:hAnsi="Consolas"/>
+                <w:b/>
+                <w:bCs/>
+                <w:color w:val="16223C"/>
+                <w:sz w:val="13"/>
+                <w:szCs w:val="13"/>
+              </w:rPr>
+              <w:t xml:space="preserve">DESIGN NOTE.  </w:t>
+            </w:r>
+            <w:r>
+              <w:rPr>
+                <w:rFonts w:ascii="Calibri" w:cs="Calibri" w:eastAsia="Calibri" w:hAnsi="Calibri"/>
+                <w:color w:val="24303F"/>
+                <w:sz w:val="17"/>
+                <w:szCs w:val="17"/>
+              </w:rPr>
+              <w:t xml:space="preserve">Navy hero band. Left column: eyebrow, serif H1 in white, subhead in a soft grey-white, then a solid bronze primary button and a ghost secondary button. Right column: the call-and-calendar visual below. Compliance badge row sits just beneath the fold as its own light strip.</w:t>
+            </w:r>
+          </w:p>
+        </w:tc>
+      </w:tr>
+    </w:tbl>
     <w:tbl>
       <w:tblPr>
         <w:tblW w:type="dxa" w:w="9360"/>
@@ -577,6 +801,67 @@
         <w:t xml:space="preserve">One quiet line. GoHighLevel gates HIPAA behind a paid add-on; Trillet includes it on every plan, which matters the moment a client is a clinic or a law firm.</w:t>
       </w:r>
     </w:p>
+    <w:tbl>
+      <w:tblPr>
+        <w:tblW w:type="dxa" w:w="9360"/>
+        <w:tblBorders>
+          <w:top w:val="none"/>
+          <w:left w:val="single" w:color="16223C" w:sz="18"/>
+          <w:bottom w:val="none"/>
+          <w:right w:val="none"/>
+          <w:insideH w:val="single" w:color="auto" w:sz="4"/>
+          <w:insideV w:val="single" w:color="auto" w:sz="4"/>
+        </w:tblBorders>
+      </w:tblPr>
+      <w:tblGrid>
+        <w:gridCol w:w="9360"/>
+      </w:tblGrid>
+      <w:tr>
+        <w:tc>
+          <w:tcPr>
+            <w:tcW w:type="dxa" w:w="9360"/>
+            <w:tcBorders>
+              <w:top w:val="none"/>
+              <w:left w:val="single" w:color="16223C" w:sz="18"/>
+              <w:bottom w:val="none"/>
+              <w:right w:val="none"/>
+            </w:tcBorders>
+            <w:shd w:fill="EDF0F6" w:color="auto" w:val="clear"/>
+            <w:tcMar>
+              <w:top w:type="dxa" w:w="90"/>
+              <w:left w:type="dxa" w:w="150"/>
+              <w:bottom w:type="dxa" w:w="90"/>
+              <w:right w:type="dxa" w:w="150"/>
+            </w:tcMar>
+          </w:tcPr>
+          <w:p>
+            <w:pPr>
+              <w:spacing w:after="0" w:line="264"/>
+            </w:pPr>
+            <w:r>
+              <w:rPr>
+                <w:rFonts w:ascii="Consolas" w:cs="Consolas" w:eastAsia="Consolas" w:hAnsi="Consolas"/>
+                <w:b/>
+                <w:bCs/>
+                <w:color w:val="16223C"/>
+                <w:sz w:val="13"/>
+                <w:szCs w:val="13"/>
+              </w:rPr>
+              <w:t xml:space="preserve">DESIGN NOTE.  </w:t>
+            </w:r>
+            <w:r>
+              <w:rPr>
+                <w:rFonts w:ascii="Calibri" w:cs="Calibri" w:eastAsia="Calibri" w:hAnsi="Calibri"/>
+                <w:color w:val="24303F"/>
+                <w:sz w:val="17"/>
+                <w:szCs w:val="17"/>
+              </w:rPr>
+              <w:t xml:space="preserve">A single centred row of badges on a white strip, hairline rule top and bottom. Badges are quiet: muted labels, small green tick, no colour blocks. This is a whisper of proof, not a banner.</w:t>
+            </w:r>
+          </w:p>
+        </w:tc>
+      </w:tr>
+    </w:tbl>
     <w:p>
       <w:pPr>
         <w:spacing w:after="50" w:before="170"/>
@@ -672,6 +957,67 @@
         <w:t xml:space="preserve">GoHighLevel already runs your pipelines, calendars and follow-up. The gap has always been the phone: someone still has to answer it and get the booking into the calendar before the caller loses patience or hangs up. Trillet answers instead, works from the same calendar your team sees, and books in real time.</w:t>
       </w:r>
     </w:p>
+    <w:tbl>
+      <w:tblPr>
+        <w:tblW w:type="dxa" w:w="9360"/>
+        <w:tblBorders>
+          <w:top w:val="none"/>
+          <w:left w:val="single" w:color="16223C" w:sz="18"/>
+          <w:bottom w:val="none"/>
+          <w:right w:val="none"/>
+          <w:insideH w:val="single" w:color="auto" w:sz="4"/>
+          <w:insideV w:val="single" w:color="auto" w:sz="4"/>
+        </w:tblBorders>
+      </w:tblPr>
+      <w:tblGrid>
+        <w:gridCol w:w="9360"/>
+      </w:tblGrid>
+      <w:tr>
+        <w:tc>
+          <w:tcPr>
+            <w:tcW w:type="dxa" w:w="9360"/>
+            <w:tcBorders>
+              <w:top w:val="none"/>
+              <w:left w:val="single" w:color="16223C" w:sz="18"/>
+              <w:bottom w:val="none"/>
+              <w:right w:val="none"/>
+            </w:tcBorders>
+            <w:shd w:fill="EDF0F6" w:color="auto" w:val="clear"/>
+            <w:tcMar>
+              <w:top w:type="dxa" w:w="90"/>
+              <w:left w:type="dxa" w:w="150"/>
+              <w:bottom w:type="dxa" w:w="90"/>
+              <w:right w:type="dxa" w:w="150"/>
+            </w:tcMar>
+          </w:tcPr>
+          <w:p>
+            <w:pPr>
+              <w:spacing w:after="0" w:line="264"/>
+            </w:pPr>
+            <w:r>
+              <w:rPr>
+                <w:rFonts w:ascii="Consolas" w:cs="Consolas" w:eastAsia="Consolas" w:hAnsi="Consolas"/>
+                <w:b/>
+                <w:bCs/>
+                <w:color w:val="16223C"/>
+                <w:sz w:val="13"/>
+                <w:szCs w:val="13"/>
+              </w:rPr>
+              <w:t xml:space="preserve">DESIGN NOTE.  </w:t>
+            </w:r>
+            <w:r>
+              <w:rPr>
+                <w:rFonts w:ascii="Calibri" w:cs="Calibri" w:eastAsia="Calibri" w:hAnsi="Calibri"/>
+                <w:color w:val="24303F"/>
+                <w:sz w:val="17"/>
+                <w:szCs w:val="17"/>
+              </w:rPr>
+              <w:t xml:space="preserve">Lead with the green-barred short-answer block (the AEO snippet), then one supporting paragraph. Green left bar signals the direct answer; keep it to five or six lines so it lifts cleanly into an answer box.</w:t>
+            </w:r>
+          </w:p>
+        </w:tc>
+      </w:tr>
+    </w:tbl>
     <w:p>
       <w:pPr>
         <w:spacing w:after="50" w:before="170"/>
@@ -850,6 +1196,67 @@
         <w:t xml:space="preserve">Give the agent the reschedule and cancel functions and a caller can change or drop an appointment on the same call, freeing the slot for the next person.</w:t>
       </w:r>
     </w:p>
+    <w:tbl>
+      <w:tblPr>
+        <w:tblW w:type="dxa" w:w="9360"/>
+        <w:tblBorders>
+          <w:top w:val="none"/>
+          <w:left w:val="single" w:color="16223C" w:sz="18"/>
+          <w:bottom w:val="none"/>
+          <w:right w:val="none"/>
+          <w:insideH w:val="single" w:color="auto" w:sz="4"/>
+          <w:insideV w:val="single" w:color="auto" w:sz="4"/>
+        </w:tblBorders>
+      </w:tblPr>
+      <w:tblGrid>
+        <w:gridCol w:w="9360"/>
+      </w:tblGrid>
+      <w:tr>
+        <w:tc>
+          <w:tcPr>
+            <w:tcW w:type="dxa" w:w="9360"/>
+            <w:tcBorders>
+              <w:top w:val="none"/>
+              <w:left w:val="single" w:color="16223C" w:sz="18"/>
+              <w:bottom w:val="none"/>
+              <w:right w:val="none"/>
+            </w:tcBorders>
+            <w:shd w:fill="EDF0F6" w:color="auto" w:val="clear"/>
+            <w:tcMar>
+              <w:top w:type="dxa" w:w="90"/>
+              <w:left w:type="dxa" w:w="150"/>
+              <w:bottom w:type="dxa" w:w="90"/>
+              <w:right w:type="dxa" w:w="150"/>
+            </w:tcMar>
+          </w:tcPr>
+          <w:p>
+            <w:pPr>
+              <w:spacing w:after="0" w:line="264"/>
+            </w:pPr>
+            <w:r>
+              <w:rPr>
+                <w:rFonts w:ascii="Consolas" w:cs="Consolas" w:eastAsia="Consolas" w:hAnsi="Consolas"/>
+                <w:b/>
+                <w:bCs/>
+                <w:color w:val="16223C"/>
+                <w:sz w:val="13"/>
+                <w:szCs w:val="13"/>
+              </w:rPr>
+              <w:t xml:space="preserve">DESIGN NOTE.  </w:t>
+            </w:r>
+            <w:r>
+              <w:rPr>
+                <w:rFonts w:ascii="Calibri" w:cs="Calibri" w:eastAsia="Calibri" w:hAnsi="Calibri"/>
+                <w:color w:val="24303F"/>
+                <w:sz w:val="17"/>
+                <w:szCs w:val="17"/>
+              </w:rPr>
+              <w:t xml:space="preserve">Render as a four-step horizontal timeline (numbered 01 to 04) with a thin connecting line, not plain bullets. Each step: bronze number, bold lead-in, one line of support. On mobile it stacks vertically with the line running down the left.</w:t>
+            </w:r>
+          </w:p>
+        </w:tc>
+      </w:tr>
+    </w:tbl>
     <w:tbl>
       <w:tblPr>
         <w:tblW w:type="dxa" w:w="9360"/>
@@ -1068,7 +1475,7 @@
         <w:tblW w:type="dxa" w:w="9360"/>
         <w:tblBorders>
           <w:top w:val="none"/>
-          <w:left w:val="single" w:color="9A6B3F" w:sz="18"/>
+          <w:left w:val="single" w:color="16223C" w:sz="18"/>
           <w:bottom w:val="none"/>
           <w:right w:val="none"/>
           <w:insideH w:val="single" w:color="auto" w:sz="4"/>
@@ -1084,11 +1491,11 @@
             <w:tcW w:type="dxa" w:w="9360"/>
             <w:tcBorders>
               <w:top w:val="none"/>
-              <w:left w:val="single" w:color="9A6B3F" w:sz="18"/>
+              <w:left w:val="single" w:color="16223C" w:sz="18"/>
               <w:bottom w:val="none"/>
               <w:right w:val="none"/>
             </w:tcBorders>
-            <w:shd w:fill="EDF1F6" w:color="auto" w:val="clear"/>
+            <w:shd w:fill="EDF0F6" w:color="auto" w:val="clear"/>
             <w:tcMar>
               <w:top w:type="dxa" w:w="90"/>
               <w:left w:type="dxa" w:w="150"/>
@@ -1105,11 +1512,11 @@
                 <w:rFonts w:ascii="Consolas" w:cs="Consolas" w:eastAsia="Consolas" w:hAnsi="Consolas"/>
                 <w:b/>
                 <w:bCs/>
-                <w:color w:val="9A6B3F"/>
-                <w:sz w:val="13"/>
-                <w:szCs w:val="13"/>
-              </w:rPr>
-              <w:t xml:space="preserve">PRODUCT SHOT.  </w:t>
+                <w:color w:val="16223C"/>
+                <w:sz w:val="13"/>
+                <w:szCs w:val="13"/>
+              </w:rPr>
+              <w:t xml:space="preserve">DESIGN NOTE.  </w:t>
             </w:r>
             <w:r>
               <w:rPr>
@@ -1118,190 +1525,12 @@
                 <w:sz w:val="17"/>
                 <w:szCs w:val="17"/>
               </w:rPr>
-              <w:t xml:space="preserve">A function's settings open in Trillet: Book an appointment selected, editable Additional instructions with a Reset control and an on/off switch, a Details to include list, and a What the agent says while this runs field.</w:t>
+              <w:t xml:space="preserve">Two-by-two card grid. Each card: bronze icon, serif H3, two or three lines. Equal-height cards, hairline border, soft shadow, generous inner padding. This is the feature showcase, so give it room.</w:t>
             </w:r>
           </w:p>
         </w:tc>
       </w:tr>
     </w:tbl>
-    <w:p>
-      <w:pPr>
-        <w:spacing w:after="50" w:before="170"/>
-      </w:pPr>
-      <w:r>
-        <w:rPr>
-          <w:rFonts w:ascii="Georgia" w:cs="Georgia" w:eastAsia="Georgia" w:hAnsi="Georgia"/>
-          <w:b/>
-          <w:bCs/>
-          <w:color w:val="16223C"/>
-          <w:sz w:val="25"/>
-          <w:szCs w:val="25"/>
-        </w:rPr>
-        <w:t xml:space="preserve">How to connect Trillet to GoHighLevel</w:t>
-      </w:r>
-    </w:p>
-    <w:p>
-      <w:pPr>
-        <w:spacing w:after="110" w:line="278"/>
-      </w:pPr>
-      <w:r>
-        <w:rPr>
-          <w:rFonts w:ascii="Calibri" w:cs="Calibri" w:eastAsia="Calibri" w:hAnsi="Calibri"/>
-          <w:b w:val="false"/>
-          <w:bCs w:val="false"/>
-          <w:i w:val="false"/>
-          <w:iCs w:val="false"/>
-          <w:color w:val="5A6675"/>
-          <w:sz w:val="18"/>
-          <w:szCs w:val="18"/>
-        </w:rPr>
-        <w:t xml:space="preserve">No code. Connect the agent that takes bookings, point it at a calendar, and publish. You connect each agent to GoHighLevel separately.</w:t>
-      </w:r>
-    </w:p>
-    <w:p>
-      <w:pPr>
-        <w:pStyle w:val="ListParagraph"/>
-        <w:numPr>
-          <w:ilvl w:val="0"/>
-          <w:numId w:val="2"/>
-        </w:numPr>
-        <w:spacing w:after="60" w:line="272"/>
-      </w:pPr>
-      <w:r>
-        <w:rPr>
-          <w:rFonts w:ascii="Calibri" w:cs="Calibri" w:eastAsia="Calibri" w:hAnsi="Calibri"/>
-          <w:b/>
-          <w:bCs/>
-          <w:i w:val="false"/>
-          <w:iCs w:val="false"/>
-          <w:color w:val="24303F"/>
-          <w:sz w:val="20"/>
-          <w:szCs w:val="20"/>
-        </w:rPr>
-        <w:t xml:space="preserve">Connect the account. </w:t>
-      </w:r>
-      <w:r>
-        <w:rPr>
-          <w:rFonts w:ascii="Calibri" w:cs="Calibri" w:eastAsia="Calibri" w:hAnsi="Calibri"/>
-          <w:b w:val="false"/>
-          <w:bCs w:val="false"/>
-          <w:i w:val="false"/>
-          <w:iCs w:val="false"/>
-          <w:color w:val="24303F"/>
-          <w:sz w:val="20"/>
-          <w:szCs w:val="20"/>
-        </w:rPr>
-        <w:t xml:space="preserve">In your agent, open Advanced Settings, then Integrations, click the GoHighLevel tile and Connect. Sign in, choose the sub-account the agent should work in, and approve access. You will see “GoHighLevel connected successfully.”</w:t>
-      </w:r>
-    </w:p>
-    <w:p>
-      <w:pPr>
-        <w:pStyle w:val="ListParagraph"/>
-        <w:numPr>
-          <w:ilvl w:val="0"/>
-          <w:numId w:val="2"/>
-        </w:numPr>
-        <w:spacing w:after="60" w:line="272"/>
-      </w:pPr>
-      <w:r>
-        <w:rPr>
-          <w:rFonts w:ascii="Calibri" w:cs="Calibri" w:eastAsia="Calibri" w:hAnsi="Calibri"/>
-          <w:b/>
-          <w:bCs/>
-          <w:i w:val="false"/>
-          <w:iCs w:val="false"/>
-          <w:color w:val="24303F"/>
-          <w:sz w:val="20"/>
-          <w:szCs w:val="20"/>
-        </w:rPr>
-        <w:t xml:space="preserve">Find your Calendar ID. </w:t>
-      </w:r>
-      <w:r>
-        <w:rPr>
-          <w:rFonts w:ascii="Calibri" w:cs="Calibri" w:eastAsia="Calibri" w:hAnsi="Calibri"/>
-          <w:b w:val="false"/>
-          <w:bCs w:val="false"/>
-          <w:i w:val="false"/>
-          <w:iCs w:val="false"/>
-          <w:color w:val="24303F"/>
-          <w:sz w:val="20"/>
-          <w:szCs w:val="20"/>
-        </w:rPr>
-        <w:t xml:space="preserve">In GoHighLevel, go to Settings, then Calendars, open your calendar's share link, and copy the ID from the end of the booking link.</w:t>
-      </w:r>
-    </w:p>
-    <w:p>
-      <w:pPr>
-        <w:pStyle w:val="ListParagraph"/>
-        <w:numPr>
-          <w:ilvl w:val="0"/>
-          <w:numId w:val="2"/>
-        </w:numPr>
-        <w:spacing w:after="60" w:line="272"/>
-      </w:pPr>
-      <w:r>
-        <w:rPr>
-          <w:rFonts w:ascii="Calibri" w:cs="Calibri" w:eastAsia="Calibri" w:hAnsi="Calibri"/>
-          <w:b/>
-          <w:bCs/>
-          <w:i w:val="false"/>
-          <w:iCs w:val="false"/>
-          <w:color w:val="24303F"/>
-          <w:sz w:val="20"/>
-          <w:szCs w:val="20"/>
-        </w:rPr>
-        <w:t xml:space="preserve">Turn on Calendar Booking. </w:t>
-      </w:r>
-      <w:r>
-        <w:rPr>
-          <w:rFonts w:ascii="Calibri" w:cs="Calibri" w:eastAsia="Calibri" w:hAnsi="Calibri"/>
-          <w:b w:val="false"/>
-          <w:bCs w:val="false"/>
-          <w:i w:val="false"/>
-          <w:iCs w:val="false"/>
-          <w:color w:val="24303F"/>
-          <w:sz w:val="20"/>
-          <w:szCs w:val="20"/>
-        </w:rPr>
-        <w:t xml:space="preserve">Back in the GoHighLevel integration settings, switch on Calendar Booking, paste in the Calendar ID, and set Agent Location (Timezone) to match your GoHighLevel calendar. The timezone is required; bookings will not work without it.</w:t>
-      </w:r>
-    </w:p>
-    <w:p>
-      <w:pPr>
-        <w:pStyle w:val="ListParagraph"/>
-        <w:numPr>
-          <w:ilvl w:val="0"/>
-          <w:numId w:val="2"/>
-        </w:numPr>
-        <w:spacing w:after="60" w:line="272"/>
-      </w:pPr>
-      <w:r>
-        <w:rPr>
-          <w:rFonts w:ascii="Calibri" w:cs="Calibri" w:eastAsia="Calibri" w:hAnsi="Calibri"/>
-          <w:b/>
-          <w:bCs/>
-          <w:i w:val="false"/>
-          <w:iCs w:val="false"/>
-          <w:color w:val="24303F"/>
-          <w:sz w:val="20"/>
-          <w:szCs w:val="20"/>
-        </w:rPr>
-        <w:t xml:space="preserve">Choose the functions and publish. </w:t>
-      </w:r>
-      <w:r>
-        <w:rPr>
-          <w:rFonts w:ascii="Calibri" w:cs="Calibri" w:eastAsia="Calibri" w:hAnsi="Calibri"/>
-          <w:b w:val="false"/>
-          <w:bCs w:val="false"/>
-          <w:i w:val="false"/>
-          <w:iCs w:val="false"/>
-          <w:color w:val="24303F"/>
-          <w:sz w:val="20"/>
-          <w:szCs w:val="20"/>
-        </w:rPr>
-        <w:t xml:space="preserve">Under Functions, add what the agent can do: check availability, book, reschedule and cancel. Click Done, then Publish Changes. Nothing reaches live calls until you publish.</w:t>
-      </w:r>
-    </w:p>
     <w:tbl>
       <w:tblPr>
         <w:tblW w:type="dxa" w:w="9360"/>
@@ -1357,6 +1586,306 @@
                 <w:sz w:val="17"/>
                 <w:szCs w:val="17"/>
               </w:rPr>
+              <w:t xml:space="preserve">A function's settings open in Trillet: Book an appointment selected, editable Additional instructions with a Reset control and an on/off switch, a Details to include list, and a What the agent says while this runs field.</w:t>
+            </w:r>
+          </w:p>
+        </w:tc>
+      </w:tr>
+    </w:tbl>
+    <w:p>
+      <w:pPr>
+        <w:spacing w:after="50" w:before="170"/>
+      </w:pPr>
+      <w:r>
+        <w:rPr>
+          <w:rFonts w:ascii="Georgia" w:cs="Georgia" w:eastAsia="Georgia" w:hAnsi="Georgia"/>
+          <w:b/>
+          <w:bCs/>
+          <w:color w:val="16223C"/>
+          <w:sz w:val="25"/>
+          <w:szCs w:val="25"/>
+        </w:rPr>
+        <w:t xml:space="preserve">How to connect Trillet to GoHighLevel</w:t>
+      </w:r>
+    </w:p>
+    <w:p>
+      <w:pPr>
+        <w:spacing w:after="110" w:line="278"/>
+      </w:pPr>
+      <w:r>
+        <w:rPr>
+          <w:rFonts w:ascii="Calibri" w:cs="Calibri" w:eastAsia="Calibri" w:hAnsi="Calibri"/>
+          <w:b w:val="false"/>
+          <w:bCs w:val="false"/>
+          <w:i w:val="false"/>
+          <w:iCs w:val="false"/>
+          <w:color w:val="5A6675"/>
+          <w:sz w:val="18"/>
+          <w:szCs w:val="18"/>
+        </w:rPr>
+        <w:t xml:space="preserve">No code. Connect the agent that takes bookings, point it at a calendar, and publish. You connect each agent to GoHighLevel separately.</w:t>
+      </w:r>
+    </w:p>
+    <w:p>
+      <w:pPr>
+        <w:pStyle w:val="ListParagraph"/>
+        <w:numPr>
+          <w:ilvl w:val="0"/>
+          <w:numId w:val="2"/>
+        </w:numPr>
+        <w:spacing w:after="60" w:line="272"/>
+      </w:pPr>
+      <w:r>
+        <w:rPr>
+          <w:rFonts w:ascii="Calibri" w:cs="Calibri" w:eastAsia="Calibri" w:hAnsi="Calibri"/>
+          <w:b/>
+          <w:bCs/>
+          <w:i w:val="false"/>
+          <w:iCs w:val="false"/>
+          <w:color w:val="24303F"/>
+          <w:sz w:val="20"/>
+          <w:szCs w:val="20"/>
+        </w:rPr>
+        <w:t xml:space="preserve">Connect the account. </w:t>
+      </w:r>
+      <w:r>
+        <w:rPr>
+          <w:rFonts w:ascii="Calibri" w:cs="Calibri" w:eastAsia="Calibri" w:hAnsi="Calibri"/>
+          <w:b w:val="false"/>
+          <w:bCs w:val="false"/>
+          <w:i w:val="false"/>
+          <w:iCs w:val="false"/>
+          <w:color w:val="24303F"/>
+          <w:sz w:val="20"/>
+          <w:szCs w:val="20"/>
+        </w:rPr>
+        <w:t xml:space="preserve">In your agent, open Advanced Settings, then Integrations, click the GoHighLevel tile and Connect. Sign in, choose the sub-account the agent should work in, and approve access. You will see “GoHighLevel connected successfully.”</w:t>
+      </w:r>
+    </w:p>
+    <w:p>
+      <w:pPr>
+        <w:pStyle w:val="ListParagraph"/>
+        <w:numPr>
+          <w:ilvl w:val="0"/>
+          <w:numId w:val="2"/>
+        </w:numPr>
+        <w:spacing w:after="60" w:line="272"/>
+      </w:pPr>
+      <w:r>
+        <w:rPr>
+          <w:rFonts w:ascii="Calibri" w:cs="Calibri" w:eastAsia="Calibri" w:hAnsi="Calibri"/>
+          <w:b/>
+          <w:bCs/>
+          <w:i w:val="false"/>
+          <w:iCs w:val="false"/>
+          <w:color w:val="24303F"/>
+          <w:sz w:val="20"/>
+          <w:szCs w:val="20"/>
+        </w:rPr>
+        <w:t xml:space="preserve">Find your Calendar ID. </w:t>
+      </w:r>
+      <w:r>
+        <w:rPr>
+          <w:rFonts w:ascii="Calibri" w:cs="Calibri" w:eastAsia="Calibri" w:hAnsi="Calibri"/>
+          <w:b w:val="false"/>
+          <w:bCs w:val="false"/>
+          <w:i w:val="false"/>
+          <w:iCs w:val="false"/>
+          <w:color w:val="24303F"/>
+          <w:sz w:val="20"/>
+          <w:szCs w:val="20"/>
+        </w:rPr>
+        <w:t xml:space="preserve">In GoHighLevel, go to Settings, then Calendars, open your calendar's share link, and copy the ID from the end of the booking link.</w:t>
+      </w:r>
+    </w:p>
+    <w:p>
+      <w:pPr>
+        <w:pStyle w:val="ListParagraph"/>
+        <w:numPr>
+          <w:ilvl w:val="0"/>
+          <w:numId w:val="2"/>
+        </w:numPr>
+        <w:spacing w:after="60" w:line="272"/>
+      </w:pPr>
+      <w:r>
+        <w:rPr>
+          <w:rFonts w:ascii="Calibri" w:cs="Calibri" w:eastAsia="Calibri" w:hAnsi="Calibri"/>
+          <w:b/>
+          <w:bCs/>
+          <w:i w:val="false"/>
+          <w:iCs w:val="false"/>
+          <w:color w:val="24303F"/>
+          <w:sz w:val="20"/>
+          <w:szCs w:val="20"/>
+        </w:rPr>
+        <w:t xml:space="preserve">Turn on Calendar Booking. </w:t>
+      </w:r>
+      <w:r>
+        <w:rPr>
+          <w:rFonts w:ascii="Calibri" w:cs="Calibri" w:eastAsia="Calibri" w:hAnsi="Calibri"/>
+          <w:b w:val="false"/>
+          <w:bCs w:val="false"/>
+          <w:i w:val="false"/>
+          <w:iCs w:val="false"/>
+          <w:color w:val="24303F"/>
+          <w:sz w:val="20"/>
+          <w:szCs w:val="20"/>
+        </w:rPr>
+        <w:t xml:space="preserve">Back in the GoHighLevel integration settings, switch on Calendar Booking, paste in the Calendar ID, and set Agent Location (Timezone) to match your GoHighLevel calendar. The timezone is required; bookings will not work without it.</w:t>
+      </w:r>
+    </w:p>
+    <w:p>
+      <w:pPr>
+        <w:pStyle w:val="ListParagraph"/>
+        <w:numPr>
+          <w:ilvl w:val="0"/>
+          <w:numId w:val="2"/>
+        </w:numPr>
+        <w:spacing w:after="60" w:line="272"/>
+      </w:pPr>
+      <w:r>
+        <w:rPr>
+          <w:rFonts w:ascii="Calibri" w:cs="Calibri" w:eastAsia="Calibri" w:hAnsi="Calibri"/>
+          <w:b/>
+          <w:bCs/>
+          <w:i w:val="false"/>
+          <w:iCs w:val="false"/>
+          <w:color w:val="24303F"/>
+          <w:sz w:val="20"/>
+          <w:szCs w:val="20"/>
+        </w:rPr>
+        <w:t xml:space="preserve">Choose the functions and publish. </w:t>
+      </w:r>
+      <w:r>
+        <w:rPr>
+          <w:rFonts w:ascii="Calibri" w:cs="Calibri" w:eastAsia="Calibri" w:hAnsi="Calibri"/>
+          <w:b w:val="false"/>
+          <w:bCs w:val="false"/>
+          <w:i w:val="false"/>
+          <w:iCs w:val="false"/>
+          <w:color w:val="24303F"/>
+          <w:sz w:val="20"/>
+          <w:szCs w:val="20"/>
+        </w:rPr>
+        <w:t xml:space="preserve">Under Functions, add what the agent can do: check availability, book, reschedule and cancel. Click Done, then Publish Changes. Nothing reaches live calls until you publish.</w:t>
+      </w:r>
+    </w:p>
+    <w:tbl>
+      <w:tblPr>
+        <w:tblW w:type="dxa" w:w="9360"/>
+        <w:tblBorders>
+          <w:top w:val="none"/>
+          <w:left w:val="single" w:color="16223C" w:sz="18"/>
+          <w:bottom w:val="none"/>
+          <w:right w:val="none"/>
+          <w:insideH w:val="single" w:color="auto" w:sz="4"/>
+          <w:insideV w:val="single" w:color="auto" w:sz="4"/>
+        </w:tblBorders>
+      </w:tblPr>
+      <w:tblGrid>
+        <w:gridCol w:w="9360"/>
+      </w:tblGrid>
+      <w:tr>
+        <w:tc>
+          <w:tcPr>
+            <w:tcW w:type="dxa" w:w="9360"/>
+            <w:tcBorders>
+              <w:top w:val="none"/>
+              <w:left w:val="single" w:color="16223C" w:sz="18"/>
+              <w:bottom w:val="none"/>
+              <w:right w:val="none"/>
+            </w:tcBorders>
+            <w:shd w:fill="EDF0F6" w:color="auto" w:val="clear"/>
+            <w:tcMar>
+              <w:top w:type="dxa" w:w="90"/>
+              <w:left w:type="dxa" w:w="150"/>
+              <w:bottom w:type="dxa" w:w="90"/>
+              <w:right w:type="dxa" w:w="150"/>
+            </w:tcMar>
+          </w:tcPr>
+          <w:p>
+            <w:pPr>
+              <w:spacing w:after="0" w:line="264"/>
+            </w:pPr>
+            <w:r>
+              <w:rPr>
+                <w:rFonts w:ascii="Consolas" w:cs="Consolas" w:eastAsia="Consolas" w:hAnsi="Consolas"/>
+                <w:b/>
+                <w:bCs/>
+                <w:color w:val="16223C"/>
+                <w:sz w:val="13"/>
+                <w:szCs w:val="13"/>
+              </w:rPr>
+              <w:t xml:space="preserve">DESIGN NOTE.  </w:t>
+            </w:r>
+            <w:r>
+              <w:rPr>
+                <w:rFonts w:ascii="Calibri" w:cs="Calibri" w:eastAsia="Calibri" w:hAnsi="Calibri"/>
+                <w:color w:val="24303F"/>
+                <w:sz w:val="17"/>
+                <w:szCs w:val="17"/>
+              </w:rPr>
+              <w:t xml:space="preserve">A numbered vertical stepper on a light #F7F8FA band. Bronze step numbers in circles down the left, connected by a thin rule; each step's title bold, body muted. Keep it visually calmer than the feature grid so it reads as reassuringly simple.</w:t>
+            </w:r>
+          </w:p>
+        </w:tc>
+      </w:tr>
+    </w:tbl>
+    <w:tbl>
+      <w:tblPr>
+        <w:tblW w:type="dxa" w:w="9360"/>
+        <w:tblBorders>
+          <w:top w:val="none"/>
+          <w:left w:val="single" w:color="9A6B3F" w:sz="18"/>
+          <w:bottom w:val="none"/>
+          <w:right w:val="none"/>
+          <w:insideH w:val="single" w:color="auto" w:sz="4"/>
+          <w:insideV w:val="single" w:color="auto" w:sz="4"/>
+        </w:tblBorders>
+      </w:tblPr>
+      <w:tblGrid>
+        <w:gridCol w:w="9360"/>
+      </w:tblGrid>
+      <w:tr>
+        <w:tc>
+          <w:tcPr>
+            <w:tcW w:type="dxa" w:w="9360"/>
+            <w:tcBorders>
+              <w:top w:val="none"/>
+              <w:left w:val="single" w:color="9A6B3F" w:sz="18"/>
+              <w:bottom w:val="none"/>
+              <w:right w:val="none"/>
+            </w:tcBorders>
+            <w:shd w:fill="EDF1F6" w:color="auto" w:val="clear"/>
+            <w:tcMar>
+              <w:top w:type="dxa" w:w="90"/>
+              <w:left w:type="dxa" w:w="150"/>
+              <w:bottom w:type="dxa" w:w="90"/>
+              <w:right w:type="dxa" w:w="150"/>
+            </w:tcMar>
+          </w:tcPr>
+          <w:p>
+            <w:pPr>
+              <w:spacing w:after="0" w:line="264"/>
+            </w:pPr>
+            <w:r>
+              <w:rPr>
+                <w:rFonts w:ascii="Consolas" w:cs="Consolas" w:eastAsia="Consolas" w:hAnsi="Consolas"/>
+                <w:b/>
+                <w:bCs/>
+                <w:color w:val="9A6B3F"/>
+                <w:sz w:val="13"/>
+                <w:szCs w:val="13"/>
+              </w:rPr>
+              <w:t xml:space="preserve">PRODUCT SHOT.  </w:t>
+            </w:r>
+            <w:r>
+              <w:rPr>
+                <w:rFonts w:ascii="Calibri" w:cs="Calibri" w:eastAsia="Calibri" w:hAnsi="Calibri"/>
+                <w:color w:val="24303F"/>
+                <w:sz w:val="17"/>
+                <w:szCs w:val="17"/>
+              </w:rPr>
               <w:t xml:space="preserve">The Trillet GoHighLevel integration screen after setup: connected with a green tick, Calendar Booking on, a Calendar ID pasted in, Agent Location (Timezone) set, and all four functions marked Added.</w:t>
             </w:r>
           </w:p>
@@ -1523,6 +2052,67 @@
         <w:t xml:space="preserve">Use a Trillet number or forward your existing line. Carrier-level call forwarding goes live in about 30 seconds with no porting.</w:t>
       </w:r>
     </w:p>
+    <w:tbl>
+      <w:tblPr>
+        <w:tblW w:type="dxa" w:w="9360"/>
+        <w:tblBorders>
+          <w:top w:val="none"/>
+          <w:left w:val="single" w:color="16223C" w:sz="18"/>
+          <w:bottom w:val="none"/>
+          <w:right w:val="none"/>
+          <w:insideH w:val="single" w:color="auto" w:sz="4"/>
+          <w:insideV w:val="single" w:color="auto" w:sz="4"/>
+        </w:tblBorders>
+      </w:tblPr>
+      <w:tblGrid>
+        <w:gridCol w:w="9360"/>
+      </w:tblGrid>
+      <w:tr>
+        <w:tc>
+          <w:tcPr>
+            <w:tcW w:type="dxa" w:w="9360"/>
+            <w:tcBorders>
+              <w:top w:val="none"/>
+              <w:left w:val="single" w:color="16223C" w:sz="18"/>
+              <w:bottom w:val="none"/>
+              <w:right w:val="none"/>
+            </w:tcBorders>
+            <w:shd w:fill="EDF0F6" w:color="auto" w:val="clear"/>
+            <w:tcMar>
+              <w:top w:type="dxa" w:w="90"/>
+              <w:left w:type="dxa" w:w="150"/>
+              <w:bottom w:type="dxa" w:w="90"/>
+              <w:right w:type="dxa" w:w="150"/>
+            </w:tcMar>
+          </w:tcPr>
+          <w:p>
+            <w:pPr>
+              <w:spacing w:after="0" w:line="264"/>
+            </w:pPr>
+            <w:r>
+              <w:rPr>
+                <w:rFonts w:ascii="Consolas" w:cs="Consolas" w:eastAsia="Consolas" w:hAnsi="Consolas"/>
+                <w:b/>
+                <w:bCs/>
+                <w:color w:val="16223C"/>
+                <w:sz w:val="13"/>
+                <w:szCs w:val="13"/>
+              </w:rPr>
+              <w:t xml:space="preserve">DESIGN NOTE.  </w:t>
+            </w:r>
+            <w:r>
+              <w:rPr>
+                <w:rFonts w:ascii="Calibri" w:cs="Calibri" w:eastAsia="Calibri" w:hAnsi="Calibri"/>
+                <w:color w:val="24303F"/>
+                <w:sz w:val="17"/>
+                <w:szCs w:val="17"/>
+              </w:rPr>
+              <w:t xml:space="preserve">Navy band, reversed out. Four short items in a two-by-two grid, white text, a small bronze tick or rule marking each. This is the differentiator moment, so let it carry the page's second dark band and sit right before pricing.</w:t>
+            </w:r>
+          </w:p>
+        </w:tc>
+      </w:tr>
+    </w:tbl>
     <w:p>
       <w:pPr>
         <w:spacing w:after="50" w:before="170"/>
@@ -1589,6 +2179,67 @@
         <w:t xml:space="preserve">.</w:t>
       </w:r>
     </w:p>
+    <w:tbl>
+      <w:tblPr>
+        <w:tblW w:type="dxa" w:w="9360"/>
+        <w:tblBorders>
+          <w:top w:val="none"/>
+          <w:left w:val="single" w:color="16223C" w:sz="18"/>
+          <w:bottom w:val="none"/>
+          <w:right w:val="none"/>
+          <w:insideH w:val="single" w:color="auto" w:sz="4"/>
+          <w:insideV w:val="single" w:color="auto" w:sz="4"/>
+        </w:tblBorders>
+      </w:tblPr>
+      <w:tblGrid>
+        <w:gridCol w:w="9360"/>
+      </w:tblGrid>
+      <w:tr>
+        <w:tc>
+          <w:tcPr>
+            <w:tcW w:type="dxa" w:w="9360"/>
+            <w:tcBorders>
+              <w:top w:val="none"/>
+              <w:left w:val="single" w:color="16223C" w:sz="18"/>
+              <w:bottom w:val="none"/>
+              <w:right w:val="none"/>
+            </w:tcBorders>
+            <w:shd w:fill="EDF0F6" w:color="auto" w:val="clear"/>
+            <w:tcMar>
+              <w:top w:type="dxa" w:w="90"/>
+              <w:left w:type="dxa" w:w="150"/>
+              <w:bottom w:type="dxa" w:w="90"/>
+              <w:right w:type="dxa" w:w="150"/>
+            </w:tcMar>
+          </w:tcPr>
+          <w:p>
+            <w:pPr>
+              <w:spacing w:after="0" w:line="264"/>
+            </w:pPr>
+            <w:r>
+              <w:rPr>
+                <w:rFonts w:ascii="Consolas" w:cs="Consolas" w:eastAsia="Consolas" w:hAnsi="Consolas"/>
+                <w:b/>
+                <w:bCs/>
+                <w:color w:val="16223C"/>
+                <w:sz w:val="13"/>
+                <w:szCs w:val="13"/>
+              </w:rPr>
+              <w:t xml:space="preserve">DESIGN NOTE.  </w:t>
+            </w:r>
+            <w:r>
+              <w:rPr>
+                <w:rFonts w:ascii="Calibri" w:cs="Calibri" w:eastAsia="Calibri" w:hAnsi="Calibri"/>
+                <w:color w:val="24303F"/>
+                <w:sz w:val="17"/>
+                <w:szCs w:val="17"/>
+              </w:rPr>
+              <w:t xml:space="preserve">A slim single-line band, not a full section: one sentence and the link, on white with a bronze left rule. Small by design so it points to /whitelabel without competing with the booking story.</w:t>
+            </w:r>
+          </w:p>
+        </w:tc>
+      </w:tr>
+    </w:tbl>
     <w:p>
       <w:pPr>
         <w:spacing w:after="50" w:before="170"/>
@@ -2210,6 +2861,67 @@
         <w:t xml:space="preserve">    See pricing</w:t>
       </w:r>
     </w:p>
+    <w:tbl>
+      <w:tblPr>
+        <w:tblW w:type="dxa" w:w="9360"/>
+        <w:tblBorders>
+          <w:top w:val="none"/>
+          <w:left w:val="single" w:color="16223C" w:sz="18"/>
+          <w:bottom w:val="none"/>
+          <w:right w:val="none"/>
+          <w:insideH w:val="single" w:color="auto" w:sz="4"/>
+          <w:insideV w:val="single" w:color="auto" w:sz="4"/>
+        </w:tblBorders>
+      </w:tblPr>
+      <w:tblGrid>
+        <w:gridCol w:w="9360"/>
+      </w:tblGrid>
+      <w:tr>
+        <w:tc>
+          <w:tcPr>
+            <w:tcW w:type="dxa" w:w="9360"/>
+            <w:tcBorders>
+              <w:top w:val="none"/>
+              <w:left w:val="single" w:color="16223C" w:sz="18"/>
+              <w:bottom w:val="none"/>
+              <w:right w:val="none"/>
+            </w:tcBorders>
+            <w:shd w:fill="EDF0F6" w:color="auto" w:val="clear"/>
+            <w:tcMar>
+              <w:top w:type="dxa" w:w="90"/>
+              <w:left w:type="dxa" w:w="150"/>
+              <w:bottom w:type="dxa" w:w="90"/>
+              <w:right w:type="dxa" w:w="150"/>
+            </w:tcMar>
+          </w:tcPr>
+          <w:p>
+            <w:pPr>
+              <w:spacing w:after="0" w:line="264"/>
+            </w:pPr>
+            <w:r>
+              <w:rPr>
+                <w:rFonts w:ascii="Consolas" w:cs="Consolas" w:eastAsia="Consolas" w:hAnsi="Consolas"/>
+                <w:b/>
+                <w:bCs/>
+                <w:color w:val="16223C"/>
+                <w:sz w:val="13"/>
+                <w:szCs w:val="13"/>
+              </w:rPr>
+              <w:t xml:space="preserve">DESIGN NOTE.  </w:t>
+            </w:r>
+            <w:r>
+              <w:rPr>
+                <w:rFonts w:ascii="Calibri" w:cs="Calibri" w:eastAsia="Calibri" w:hAnsi="Calibri"/>
+                <w:color w:val="24303F"/>
+                <w:sz w:val="17"/>
+                <w:szCs w:val="17"/>
+              </w:rPr>
+              <w:t xml:space="preserve">Two plan cards side by side, Agency marked as the emphasis card (navy header or a bronze “most popular” tab). Usage line above the cards, guarantee line quietly beneath. Each card ends in its own Start button.</w:t>
+            </w:r>
+          </w:p>
+        </w:tc>
+      </w:tr>
+    </w:tbl>
     <w:p>
       <w:pPr>
         <w:spacing w:after="50" w:before="170"/>
@@ -2482,6 +3194,67 @@
         <w:t xml:space="preserve">Last reviewed: September 2026.</w:t>
       </w:r>
     </w:p>
+    <w:tbl>
+      <w:tblPr>
+        <w:tblW w:type="dxa" w:w="9360"/>
+        <w:tblBorders>
+          <w:top w:val="none"/>
+          <w:left w:val="single" w:color="16223C" w:sz="18"/>
+          <w:bottom w:val="none"/>
+          <w:right w:val="none"/>
+          <w:insideH w:val="single" w:color="auto" w:sz="4"/>
+          <w:insideV w:val="single" w:color="auto" w:sz="4"/>
+        </w:tblBorders>
+      </w:tblPr>
+      <w:tblGrid>
+        <w:gridCol w:w="9360"/>
+      </w:tblGrid>
+      <w:tr>
+        <w:tc>
+          <w:tcPr>
+            <w:tcW w:type="dxa" w:w="9360"/>
+            <w:tcBorders>
+              <w:top w:val="none"/>
+              <w:left w:val="single" w:color="16223C" w:sz="18"/>
+              <w:bottom w:val="none"/>
+              <w:right w:val="none"/>
+            </w:tcBorders>
+            <w:shd w:fill="EDF0F6" w:color="auto" w:val="clear"/>
+            <w:tcMar>
+              <w:top w:type="dxa" w:w="90"/>
+              <w:left w:type="dxa" w:w="150"/>
+              <w:bottom w:type="dxa" w:w="90"/>
+              <w:right w:type="dxa" w:w="150"/>
+            </w:tcMar>
+          </w:tcPr>
+          <w:p>
+            <w:pPr>
+              <w:spacing w:after="0" w:line="264"/>
+            </w:pPr>
+            <w:r>
+              <w:rPr>
+                <w:rFonts w:ascii="Consolas" w:cs="Consolas" w:eastAsia="Consolas" w:hAnsi="Consolas"/>
+                <w:b/>
+                <w:bCs/>
+                <w:color w:val="16223C"/>
+                <w:sz w:val="13"/>
+                <w:szCs w:val="13"/>
+              </w:rPr>
+              <w:t xml:space="preserve">DESIGN NOTE.  </w:t>
+            </w:r>
+            <w:r>
+              <w:rPr>
+                <w:rFonts w:ascii="Calibri" w:cs="Calibri" w:eastAsia="Calibri" w:hAnsi="Calibri"/>
+                <w:color w:val="24303F"/>
+                <w:sz w:val="17"/>
+                <w:szCs w:val="17"/>
+              </w:rPr>
+              <w:t xml:space="preserve">Accordion on white. Each question a row with a bronze plus/minus control; first item open by default. Serif questions, sans answers. Mirror this copy verbatim into the FAQPage schema.</w:t>
+            </w:r>
+          </w:p>
+        </w:tc>
+      </w:tr>
+    </w:tbl>
     <w:p>
       <w:pPr>
         <w:spacing w:after="30" w:before="130"/>
@@ -2608,6 +3381,67 @@
         <w:t xml:space="preserve">    Book a demo</w:t>
       </w:r>
     </w:p>
+    <w:tbl>
+      <w:tblPr>
+        <w:tblW w:type="dxa" w:w="9360"/>
+        <w:tblBorders>
+          <w:top w:val="none"/>
+          <w:left w:val="single" w:color="16223C" w:sz="18"/>
+          <w:bottom w:val="none"/>
+          <w:right w:val="none"/>
+          <w:insideH w:val="single" w:color="auto" w:sz="4"/>
+          <w:insideV w:val="single" w:color="auto" w:sz="4"/>
+        </w:tblBorders>
+      </w:tblPr>
+      <w:tblGrid>
+        <w:gridCol w:w="9360"/>
+      </w:tblGrid>
+      <w:tr>
+        <w:tc>
+          <w:tcPr>
+            <w:tcW w:type="dxa" w:w="9360"/>
+            <w:tcBorders>
+              <w:top w:val="none"/>
+              <w:left w:val="single" w:color="16223C" w:sz="18"/>
+              <w:bottom w:val="none"/>
+              <w:right w:val="none"/>
+            </w:tcBorders>
+            <w:shd w:fill="EDF0F6" w:color="auto" w:val="clear"/>
+            <w:tcMar>
+              <w:top w:type="dxa" w:w="90"/>
+              <w:left w:type="dxa" w:w="150"/>
+              <w:bottom w:type="dxa" w:w="90"/>
+              <w:right w:type="dxa" w:w="150"/>
+            </w:tcMar>
+          </w:tcPr>
+          <w:p>
+            <w:pPr>
+              <w:spacing w:after="0" w:line="264"/>
+            </w:pPr>
+            <w:r>
+              <w:rPr>
+                <w:rFonts w:ascii="Consolas" w:cs="Consolas" w:eastAsia="Consolas" w:hAnsi="Consolas"/>
+                <w:b/>
+                <w:bCs/>
+                <w:color w:val="16223C"/>
+                <w:sz w:val="13"/>
+                <w:szCs w:val="13"/>
+              </w:rPr>
+              <w:t xml:space="preserve">DESIGN NOTE.  </w:t>
+            </w:r>
+            <w:r>
+              <w:rPr>
+                <w:rFonts w:ascii="Calibri" w:cs="Calibri" w:eastAsia="Calibri" w:hAnsi="Calibri"/>
+                <w:color w:val="24303F"/>
+                <w:sz w:val="17"/>
+                <w:szCs w:val="17"/>
+              </w:rPr>
+              <w:t xml:space="preserve">Full-bleed navy closing band, centred. Serif H2 in white, one supporting line, then the bronze primary button and a ghost secondary. This is the page's second and final dark band, bookending the hero.</w:t>
+            </w:r>
+          </w:p>
+        </w:tc>
+      </w:tr>
+    </w:tbl>
     <w:p>
       <w:pPr>
         <w:pBdr>

</xml_diff>